<commit_message>
modelos novos do documento de extensão
</commit_message>
<xml_diff>
--- a/Documentos/Documento - Projeto de Extensão - COM Empresa.docx
+++ b/Documentos/Documento - Projeto de Extensão - COM Empresa.docx
@@ -169,70 +169,61 @@
       <w:tr>
         <w:trPr>
           <w:cantSplit w:val="0"/>
-          <w:trHeight w:val="750" w:hRule="atLeast"/>
           <w:tblHeader w:val="0"/>
         </w:trPr>
         <w:tc>
           <w:tcPr/>
           <w:p>
             <w:pPr>
-              <w:keepNext w:val="0"/>
-              <w:keepLines w:val="0"/>
-              <w:widowControl w:val="1"/>
-              <w:pBdr>
-                <w:top w:space="0" w:sz="0" w:val="nil"/>
-                <w:left w:space="0" w:sz="0" w:val="nil"/>
-                <w:bottom w:space="0" w:sz="0" w:val="nil"/>
-                <w:right w:space="0" w:sz="0" w:val="nil"/>
-                <w:between w:space="0" w:sz="0" w:val="nil"/>
-              </w:pBdr>
-              <w:shd w:fill="auto" w:val="clear"/>
-              <w:spacing w:after="0" w:before="0" w:line="240" w:lineRule="auto"/>
-              <w:ind w:left="0" w:right="0" w:firstLine="0"/>
+              <w:spacing w:after="0" w:line="240" w:lineRule="auto"/>
               <w:jc w:val="center"/>
               <w:rPr>
                 <w:rFonts w:ascii="Arial" w:cs="Arial" w:eastAsia="Arial" w:hAnsi="Arial"/>
                 <w:b w:val="1"/>
                 <w:bCs w:val="1"/>
-                <w:sz w:val="20"/>
-                <w:szCs w:val="20"/>
-              </w:rPr>
-            </w:pPr>
-            <w:r>
-              <w:rPr>
-                <w:rtl w:val="0"/>
-              </w:rPr>
-            </w:r>
-          </w:p>
-          <w:p>
-            <w:pPr>
-              <w:keepNext w:val="0"/>
-              <w:keepLines w:val="0"/>
-              <w:widowControl w:val="1"/>
-              <w:pBdr>
-                <w:top w:space="0" w:sz="0" w:val="nil"/>
-                <w:left w:space="0" w:sz="0" w:val="nil"/>
-                <w:bottom w:space="0" w:sz="0" w:val="nil"/>
-                <w:right w:space="0" w:sz="0" w:val="nil"/>
-                <w:between w:space="0" w:sz="0" w:val="nil"/>
-              </w:pBdr>
-              <w:shd w:fill="auto" w:val="clear"/>
-              <w:spacing w:after="0" w:before="0" w:line="240" w:lineRule="auto"/>
-              <w:ind w:left="0" w:right="0" w:firstLine="0"/>
+              </w:rPr>
+            </w:pPr>
+            <w:r>
+              <w:rPr>
+                <w:rtl w:val="0"/>
+              </w:rPr>
+            </w:r>
+          </w:p>
+          <w:p>
+            <w:pPr>
+              <w:spacing w:after="0" w:line="240" w:lineRule="auto"/>
               <w:jc w:val="center"/>
-              <w:rPr>
-                <w:rFonts w:ascii="Arial" w:cs="Arial" w:eastAsia="Arial" w:hAnsi="Arial"/>
-              </w:rPr>
-            </w:pPr>
-            <w:r>
               <w:rPr>
                 <w:rFonts w:ascii="Arial" w:cs="Arial" w:eastAsia="Arial" w:hAnsi="Arial"/>
                 <w:b w:val="1"/>
                 <w:bCs w:val="1"/>
+              </w:rPr>
+            </w:pPr>
+            <w:r>
+              <w:rPr>
+                <w:rFonts w:ascii="Arial" w:cs="Arial" w:eastAsia="Arial" w:hAnsi="Arial"/>
+                <w:b w:val="1"/>
+                <w:bCs w:val="1"/>
                 <w:rtl w:val="0"/>
               </w:rPr>
               <w:t xml:space="preserve">Alinha+</w:t>
             </w:r>
+            <w:r>
+              <w:rPr>
+                <w:rtl w:val="0"/>
+              </w:rPr>
+            </w:r>
+          </w:p>
+          <w:p>
+            <w:pPr>
+              <w:spacing w:after="0" w:line="240" w:lineRule="auto"/>
+              <w:jc w:val="center"/>
+              <w:rPr>
+                <w:rFonts w:ascii="Arial" w:cs="Arial" w:eastAsia="Arial" w:hAnsi="Arial"/>
+                <w:b w:val="1"/>
+                <w:bCs w:val="1"/>
+              </w:rPr>
+            </w:pPr>
             <w:r>
               <w:rPr>
                 <w:rtl w:val="0"/>
@@ -298,17 +289,17 @@
           <w:rFonts w:ascii="Arial" w:cs="Arial" w:eastAsia="Arial" w:hAnsi="Arial"/>
           <w:b w:val="1"/>
           <w:bCs w:val="1"/>
-          <w:color w:val="525252"/>
-          <w:sz w:val="20"/>
-          <w:szCs w:val="20"/>
-        </w:rPr>
-      </w:pPr>
-      <w:r>
-        <w:rPr>
-          <w:rFonts w:ascii="Arial" w:cs="Arial" w:eastAsia="Arial" w:hAnsi="Arial"/>
-          <w:b w:val="1"/>
-          <w:bCs w:val="1"/>
-          <w:color w:val="525252"/>
+          <w:color w:val="0c3512"/>
+          <w:sz w:val="20"/>
+          <w:szCs w:val="20"/>
+        </w:rPr>
+      </w:pPr>
+      <w:r>
+        <w:rPr>
+          <w:rFonts w:ascii="Arial" w:cs="Arial" w:eastAsia="Arial" w:hAnsi="Arial"/>
+          <w:b w:val="1"/>
+          <w:bCs w:val="1"/>
+          <w:color w:val="0c3512"/>
           <w:sz w:val="16"/>
           <w:szCs w:val="16"/>
           <w:rtl w:val="0"/>
@@ -354,9 +345,7 @@
           <w:tblHeader w:val="0"/>
         </w:trPr>
         <w:tc>
-          <w:tcPr>
-            <w:shd w:fill="auto" w:val="clear"/>
-          </w:tcPr>
+          <w:tcPr/>
           <w:p>
             <w:pPr>
               <w:spacing w:after="0" w:line="240" w:lineRule="auto"/>
@@ -397,9 +386,7 @@
           </w:p>
         </w:tc>
         <w:tc>
-          <w:tcPr>
-            <w:shd w:fill="auto" w:val="clear"/>
-          </w:tcPr>
+          <w:tcPr/>
           <w:p>
             <w:pPr>
               <w:spacing w:after="0" w:line="240" w:lineRule="auto"/>
@@ -436,10 +423,12 @@
         <w:tc>
           <w:tcPr>
             <w:shd w:fill="auto" w:val="clear"/>
+            <w:vAlign w:val="center"/>
           </w:tcPr>
           <w:p>
             <w:pPr>
               <w:spacing w:after="0" w:line="240" w:lineRule="auto"/>
+              <w:jc w:val="center"/>
               <w:rPr>
                 <w:rFonts w:ascii="Arial" w:cs="Arial" w:eastAsia="Arial" w:hAnsi="Arial"/>
                 <w:b w:val="1"/>
@@ -463,6 +452,7 @@
           <w:p>
             <w:pPr>
               <w:spacing w:after="0" w:line="240" w:lineRule="auto"/>
+              <w:jc w:val="center"/>
               <w:rPr>
                 <w:rFonts w:ascii="Arial" w:cs="Arial" w:eastAsia="Arial" w:hAnsi="Arial"/>
                 <w:b w:val="1"/>
@@ -481,10 +471,12 @@
         <w:tc>
           <w:tcPr>
             <w:shd w:fill="auto" w:val="clear"/>
+            <w:vAlign w:val="center"/>
           </w:tcPr>
           <w:p>
             <w:pPr>
               <w:spacing w:after="0" w:line="240" w:lineRule="auto"/>
+              <w:jc w:val="center"/>
               <w:rPr>
                 <w:rFonts w:ascii="Arial" w:cs="Arial" w:eastAsia="Arial" w:hAnsi="Arial"/>
                 <w:b w:val="1"/>
@@ -515,10 +507,12 @@
         <w:tc>
           <w:tcPr>
             <w:shd w:fill="auto" w:val="clear"/>
+            <w:vAlign w:val="center"/>
           </w:tcPr>
           <w:p>
             <w:pPr>
               <w:spacing w:after="0" w:line="240" w:lineRule="auto"/>
+              <w:jc w:val="center"/>
               <w:rPr>
                 <w:rFonts w:ascii="Arial" w:cs="Arial" w:eastAsia="Arial" w:hAnsi="Arial"/>
                 <w:b w:val="1"/>
@@ -542,6 +536,7 @@
           <w:p>
             <w:pPr>
               <w:spacing w:after="0" w:line="240" w:lineRule="auto"/>
+              <w:jc w:val="center"/>
               <w:rPr>
                 <w:rFonts w:ascii="Arial" w:cs="Arial" w:eastAsia="Arial" w:hAnsi="Arial"/>
                 <w:b w:val="1"/>
@@ -560,10 +555,12 @@
         <w:tc>
           <w:tcPr>
             <w:shd w:fill="auto" w:val="clear"/>
+            <w:vAlign w:val="center"/>
           </w:tcPr>
           <w:p>
             <w:pPr>
               <w:spacing w:after="0" w:line="240" w:lineRule="auto"/>
+              <w:jc w:val="center"/>
               <w:rPr>
                 <w:rFonts w:ascii="Arial" w:cs="Arial" w:eastAsia="Arial" w:hAnsi="Arial"/>
                 <w:b w:val="1"/>
@@ -594,10 +591,12 @@
         <w:tc>
           <w:tcPr>
             <w:shd w:fill="auto" w:val="clear"/>
+            <w:vAlign w:val="center"/>
           </w:tcPr>
           <w:p>
             <w:pPr>
               <w:spacing w:after="0" w:line="240" w:lineRule="auto"/>
+              <w:jc w:val="center"/>
               <w:rPr>
                 <w:rFonts w:ascii="Arial" w:cs="Arial" w:eastAsia="Arial" w:hAnsi="Arial"/>
                 <w:b w:val="1"/>
@@ -621,6 +620,7 @@
           <w:p>
             <w:pPr>
               <w:spacing w:after="0" w:line="240" w:lineRule="auto"/>
+              <w:jc w:val="center"/>
               <w:rPr>
                 <w:rFonts w:ascii="Arial" w:cs="Arial" w:eastAsia="Arial" w:hAnsi="Arial"/>
                 <w:b w:val="1"/>
@@ -639,10 +639,12 @@
         <w:tc>
           <w:tcPr>
             <w:shd w:fill="auto" w:val="clear"/>
+            <w:vAlign w:val="center"/>
           </w:tcPr>
           <w:p>
             <w:pPr>
               <w:spacing w:after="0" w:line="240" w:lineRule="auto"/>
+              <w:jc w:val="center"/>
               <w:rPr>
                 <w:rFonts w:ascii="Arial" w:cs="Arial" w:eastAsia="Arial" w:hAnsi="Arial"/>
                 <w:b w:val="1"/>
@@ -673,10 +675,12 @@
         <w:tc>
           <w:tcPr>
             <w:shd w:fill="auto" w:val="clear"/>
+            <w:vAlign w:val="center"/>
           </w:tcPr>
           <w:p>
             <w:pPr>
               <w:spacing w:after="0" w:line="240" w:lineRule="auto"/>
+              <w:jc w:val="center"/>
               <w:rPr>
                 <w:rFonts w:ascii="Arial" w:cs="Arial" w:eastAsia="Arial" w:hAnsi="Arial"/>
                 <w:b w:val="1"/>
@@ -727,6 +731,7 @@
           <w:p>
             <w:pPr>
               <w:spacing w:after="0" w:line="240" w:lineRule="auto"/>
+              <w:jc w:val="center"/>
               <w:rPr>
                 <w:rFonts w:ascii="Arial" w:cs="Arial" w:eastAsia="Arial" w:hAnsi="Arial"/>
                 <w:b w:val="1"/>
@@ -745,10 +750,12 @@
         <w:tc>
           <w:tcPr>
             <w:shd w:fill="auto" w:val="clear"/>
+            <w:vAlign w:val="center"/>
           </w:tcPr>
           <w:p>
             <w:pPr>
               <w:spacing w:after="0" w:line="240" w:lineRule="auto"/>
+              <w:jc w:val="center"/>
               <w:rPr>
                 <w:rFonts w:ascii="Arial" w:cs="Arial" w:eastAsia="Arial" w:hAnsi="Arial"/>
                 <w:b w:val="1"/>
@@ -767,23 +774,6 @@
                 <w:rtl w:val="0"/>
               </w:rPr>
               <w:t xml:space="preserve">25027647</w:t>
-            </w:r>
-          </w:p>
-          <w:p>
-            <w:pPr>
-              <w:spacing w:after="0" w:line="240" w:lineRule="auto"/>
-              <w:rPr>
-                <w:rFonts w:ascii="Arial" w:cs="Arial" w:eastAsia="Arial" w:hAnsi="Arial"/>
-                <w:b w:val="1"/>
-                <w:bCs w:val="1"/>
-                <w:sz w:val="20"/>
-                <w:szCs w:val="20"/>
-              </w:rPr>
-            </w:pPr>
-            <w:r>
-              <w:rPr>
-                <w:rtl w:val="0"/>
-              </w:rPr>
             </w:r>
           </w:p>
         </w:tc>
@@ -883,18 +873,12 @@
           <w:tcPr/>
           <w:p>
             <w:pPr>
-              <w:pBdr>
-                <w:top w:space="0" w:sz="0" w:val="nil"/>
-                <w:left w:space="0" w:sz="0" w:val="nil"/>
-                <w:bottom w:space="0" w:sz="0" w:val="nil"/>
-                <w:right w:space="0" w:sz="0" w:val="nil"/>
-                <w:between w:space="0" w:sz="0" w:val="nil"/>
-              </w:pBdr>
               <w:jc w:val="both"/>
               <w:rPr>
                 <w:rFonts w:ascii="Arial" w:cs="Arial" w:eastAsia="Arial" w:hAnsi="Arial"/>
                 <w:b w:val="1"/>
                 <w:bCs w:val="1"/>
+                <w:color w:val="000000"/>
                 <w:sz w:val="20"/>
                 <w:szCs w:val="20"/>
               </w:rPr>
@@ -909,6 +893,11 @@
                 <w:rtl w:val="0"/>
               </w:rPr>
               <w:t xml:space="preserve">Kátia Bossi, Marco Aurélio Lima Barbosa, Rodrigo da Rosa e Victor Bruno Alexander Rosetti de Quiroz</w:t>
+            </w:r>
+            <w:r>
+              <w:rPr>
+                <w:rtl w:val="0"/>
+              </w:rPr>
             </w:r>
           </w:p>
         </w:tc>
@@ -1007,13 +996,6 @@
           <w:tcPr/>
           <w:p>
             <w:pPr>
-              <w:pBdr>
-                <w:top w:space="0" w:sz="0" w:val="nil"/>
-                <w:left w:space="0" w:sz="0" w:val="nil"/>
-                <w:bottom w:space="0" w:sz="0" w:val="nil"/>
-                <w:right w:space="0" w:sz="0" w:val="nil"/>
-                <w:between w:space="0" w:sz="0" w:val="nil"/>
-              </w:pBdr>
               <w:jc w:val="both"/>
               <w:rPr>
                 <w:rFonts w:ascii="Arial" w:cs="Arial" w:eastAsia="Arial" w:hAnsi="Arial"/>
@@ -1102,7 +1084,7 @@
           <w:rFonts w:ascii="Arial" w:cs="Arial" w:eastAsia="Arial" w:hAnsi="Arial"/>
           <w:b w:val="1"/>
           <w:bCs w:val="1"/>
-          <w:color w:val="525252"/>
+          <w:color w:val="0c3512"/>
           <w:sz w:val="20"/>
           <w:szCs w:val="20"/>
         </w:rPr>
@@ -1112,7 +1094,7 @@
           <w:rFonts w:ascii="Arial Unicode MS" w:cs="Arial Unicode MS" w:eastAsia="Arial Unicode MS" w:hAnsi="Arial Unicode MS"/>
           <w:b w:val="1"/>
           <w:bCs w:val="1"/>
-          <w:color w:val="525252"/>
+          <w:color w:val="0c3512"/>
           <w:sz w:val="16"/>
           <w:szCs w:val="16"/>
           <w:rtl w:val="0"/>
@@ -1121,7 +1103,7 @@
       </w:r>
       <w:r>
         <w:rPr>
-          <w:color w:val="525252"/>
+          <w:color w:val="0c3512"/>
           <w:rtl w:val="0"/>
         </w:rPr>
         <w:t xml:space="preserve"> </w:t>
@@ -1131,7 +1113,7 @@
           <w:rFonts w:ascii="Arial" w:cs="Arial" w:eastAsia="Arial" w:hAnsi="Arial"/>
           <w:b w:val="1"/>
           <w:bCs w:val="1"/>
-          <w:color w:val="525252"/>
+          <w:color w:val="0c3512"/>
           <w:sz w:val="16"/>
           <w:szCs w:val="16"/>
           <w:rtl w:val="0"/>
@@ -1174,7 +1156,6 @@
               <w:left w:color="000000" w:space="0" w:sz="4" w:val="single"/>
               <w:bottom w:color="000000" w:space="0" w:sz="4" w:val="single"/>
             </w:tcBorders>
-            <w:shd w:fill="auto" w:val="clear"/>
           </w:tcPr>
           <w:p>
             <w:pPr>
@@ -1214,7 +1195,6 @@
               <w:bottom w:color="000000" w:space="0" w:sz="4" w:val="single"/>
               <w:right w:color="000000" w:space="0" w:sz="4" w:val="single"/>
             </w:tcBorders>
-            <w:shd w:fill="auto" w:val="clear"/>
           </w:tcPr>
           <w:p>
             <w:pPr>
@@ -1222,8 +1202,9 @@
               <w:jc w:val="both"/>
               <w:rPr>
                 <w:rFonts w:ascii="Arial" w:cs="Arial" w:eastAsia="Arial" w:hAnsi="Arial"/>
-                <w:sz w:val="28"/>
-                <w:szCs w:val="28"/>
+                <w:color w:val="000000"/>
+                <w:sz w:val="20"/>
+                <w:szCs w:val="20"/>
               </w:rPr>
             </w:pPr>
             <w:r>
@@ -1318,7 +1299,7 @@
           <w:rFonts w:ascii="Arial" w:cs="Arial" w:eastAsia="Arial" w:hAnsi="Arial"/>
           <w:b w:val="1"/>
           <w:bCs w:val="1"/>
-          <w:color w:val="525252"/>
+          <w:color w:val="0c3512"/>
           <w:sz w:val="16"/>
           <w:szCs w:val="16"/>
         </w:rPr>
@@ -1328,7 +1309,7 @@
           <w:rFonts w:ascii="Arial Unicode MS" w:cs="Arial Unicode MS" w:eastAsia="Arial Unicode MS" w:hAnsi="Arial Unicode MS"/>
           <w:b w:val="1"/>
           <w:bCs w:val="1"/>
-          <w:color w:val="525252"/>
+          <w:color w:val="0c3512"/>
           <w:sz w:val="16"/>
           <w:szCs w:val="16"/>
           <w:rtl w:val="0"/>
@@ -1369,7 +1350,6 @@
       <w:tr>
         <w:trPr>
           <w:cantSplit w:val="0"/>
-          <w:trHeight w:val="565.95703125" w:hRule="atLeast"/>
           <w:tblHeader w:val="0"/>
         </w:trPr>
         <w:tc>
@@ -1378,7 +1358,7 @@
             <w:pPr>
               <w:numPr>
                 <w:ilvl w:val="0"/>
-                <w:numId w:val="2"/>
+                <w:numId w:val="1"/>
               </w:numPr>
               <w:shd w:fill="ffffff" w:val="clear"/>
               <w:spacing w:after="0" w:line="240" w:lineRule="auto"/>
@@ -1403,7 +1383,7 @@
             <w:pPr>
               <w:numPr>
                 <w:ilvl w:val="0"/>
-                <w:numId w:val="2"/>
+                <w:numId w:val="1"/>
               </w:numPr>
               <w:shd w:fill="ffffff" w:val="clear"/>
               <w:spacing w:after="0" w:line="240" w:lineRule="auto"/>
@@ -1421,9 +1401,9 @@
                 <w:szCs w:val="20"/>
                 <w:rtl w:val="0"/>
               </w:rPr>
-              <w:t xml:space="preserve">Atividade de Extensão implementado na prática (intervenção executada) </w:t>
+              <w:t xml:space="preserve">Atividade de Extensão implementado na prática (intervenção executada)</w:t>
               <w:tab/>
-              <w:tab/>
+              <w:t xml:space="preserve">    </w:t>
             </w:r>
             <w:r>
               <w:rPr>
@@ -1496,11 +1476,11 @@
       <w:tr>
         <w:trPr>
           <w:cantSplit w:val="0"/>
+          <w:trHeight w:val="1909.86328125" w:hRule="atLeast"/>
           <w:tblHeader w:val="0"/>
         </w:trPr>
         <w:tc>
           <w:tcPr>
-            <w:shd w:fill="auto" w:val="clear"/>
             <w:tcMar>
               <w:top w:w="100.0" w:type="dxa"/>
               <w:left w:w="100.0" w:type="dxa"/>
@@ -1511,13 +1491,23 @@
           <w:p>
             <w:pPr>
               <w:widowControl w:val="0"/>
-              <w:pBdr>
-                <w:top w:space="0" w:sz="0" w:val="nil"/>
-                <w:left w:space="0" w:sz="0" w:val="nil"/>
-                <w:bottom w:space="0" w:sz="0" w:val="nil"/>
-                <w:right w:space="0" w:sz="0" w:val="nil"/>
-                <w:between w:space="0" w:sz="0" w:val="nil"/>
-              </w:pBdr>
+              <w:spacing w:after="0" w:line="240" w:lineRule="auto"/>
+              <w:jc w:val="both"/>
+              <w:rPr>
+                <w:rFonts w:ascii="Arial" w:cs="Arial" w:eastAsia="Arial" w:hAnsi="Arial"/>
+                <w:sz w:val="20"/>
+                <w:szCs w:val="20"/>
+              </w:rPr>
+            </w:pPr>
+            <w:r>
+              <w:rPr>
+                <w:rtl w:val="0"/>
+              </w:rPr>
+            </w:r>
+          </w:p>
+          <w:p>
+            <w:pPr>
+              <w:widowControl w:val="0"/>
               <w:spacing w:after="0" w:line="240" w:lineRule="auto"/>
               <w:jc w:val="both"/>
               <w:rPr>
@@ -1559,17 +1549,6 @@
         </w:rPr>
       </w:pPr>
       <w:r>
-        <w:rPr>
-          <w:rFonts w:ascii="Arial" w:cs="Arial" w:eastAsia="Arial" w:hAnsi="Arial"/>
-          <w:b w:val="1"/>
-          <w:bCs w:val="1"/>
-          <w:sz w:val="20"/>
-          <w:szCs w:val="20"/>
-          <w:rtl w:val="0"/>
-        </w:rPr>
-        <w:t xml:space="preserve"> </w:t>
-      </w:r>
-      <w:r>
         <w:br w:type="page"/>
       </w:r>
       <w:r>
@@ -1599,7 +1578,7 @@
           <w:szCs w:val="20"/>
           <w:rtl w:val="0"/>
         </w:rPr>
-        <w:t xml:space="preserve">Produto decorrente do projeto (opcional dependendo do tipo de projeto)</w:t>
+        <w:t xml:space="preserve"> Produto decorrente do projeto (opcional dependendo do tipo de projeto)</w:t>
       </w:r>
     </w:p>
     <w:tbl>
@@ -1630,12 +1609,30 @@
       <w:tr>
         <w:trPr>
           <w:cantSplit w:val="0"/>
+          <w:trHeight w:val="1590" w:hRule="atLeast"/>
           <w:tblHeader w:val="0"/>
         </w:trPr>
         <w:tc>
           <w:tcPr/>
           <w:p>
             <w:pPr>
+              <w:widowControl w:val="0"/>
+              <w:spacing w:after="0" w:line="240" w:lineRule="auto"/>
+              <w:jc w:val="both"/>
+              <w:rPr>
+                <w:rFonts w:ascii="Arial" w:cs="Arial" w:eastAsia="Arial" w:hAnsi="Arial"/>
+                <w:sz w:val="20"/>
+                <w:szCs w:val="20"/>
+              </w:rPr>
+            </w:pPr>
+            <w:r>
+              <w:rPr>
+                <w:rtl w:val="0"/>
+              </w:rPr>
+            </w:r>
+          </w:p>
+          <w:p>
+            <w:pPr>
               <w:shd w:fill="ffffff" w:val="clear"/>
               <w:jc w:val="both"/>
               <w:rPr>
@@ -1651,7 +1648,25 @@
                 <w:szCs w:val="20"/>
                 <w:rtl w:val="0"/>
               </w:rPr>
-              <w:t xml:space="preserve">Um ecossistema digital completo, desenvolvido em parceria com a Clínica de Fisioterapia Maya Yoshiko Yamamoto RPG, contendo um painel administrativo Web (desenvolvido em React) e um aplicativo Mobile (Android em Java), ambos integrados por uma API Backend em Node.js com banco de dados SQLite Cloud. A solução foi construída para atender diretamente às necessidades clínicas identificadas junto à fisioterapeuta responsável.</w:t>
+              <w:t xml:space="preserve">Um ecossistema digital completo, desenvolvido em parceria com a Clínica de Fisioterapia Maya Yoshiko Yamamoto RPG, contendo um painel administrativo Web (desenvolvido em React) </w:t>
+            </w:r>
+            <w:r>
+              <w:rPr>
+                <w:rFonts w:ascii="Arial" w:cs="Arial" w:eastAsia="Arial" w:hAnsi="Arial"/>
+                <w:sz w:val="20"/>
+                <w:szCs w:val="20"/>
+                <w:rtl w:val="0"/>
+              </w:rPr>
+              <w:t xml:space="preserve">e um</w:t>
+            </w:r>
+            <w:r>
+              <w:rPr>
+                <w:rFonts w:ascii="Arial" w:cs="Arial" w:eastAsia="Arial" w:hAnsi="Arial"/>
+                <w:sz w:val="20"/>
+                <w:szCs w:val="20"/>
+                <w:rtl w:val="0"/>
+              </w:rPr>
+              <w:t xml:space="preserve"> aplicativo Mobile (Android em Java), ambos integrados por uma API Backend em Node.js com banco de dados SQLite Cloud. A solução foi construída para atender diretamente às necessidades clínicas identificadas junto à fisioterapeuta responsável.</w:t>
             </w:r>
           </w:p>
           <w:p>
@@ -1659,20 +1674,34 @@
               <w:shd w:fill="ffffff" w:val="clear"/>
               <w:rPr>
                 <w:rFonts w:ascii="Arial" w:cs="Arial" w:eastAsia="Arial" w:hAnsi="Arial"/>
-                <w:color w:val="525252"/>
-                <w:sz w:val="20"/>
-                <w:szCs w:val="20"/>
-              </w:rPr>
-            </w:pPr>
-            <w:r>
-              <w:rPr>
-                <w:rFonts w:ascii="Arial" w:cs="Arial" w:eastAsia="Arial" w:hAnsi="Arial"/>
-                <w:sz w:val="20"/>
-                <w:szCs w:val="20"/>
-                <w:rtl w:val="0"/>
-              </w:rPr>
-              <w:t xml:space="preserve">O repositório e o código-fonte estão disponíveis no GitHub: https://github.com/2026-1-NCC3/Projeto3</w:t>
-            </w:r>
+                <w:b w:val="1"/>
+                <w:bCs w:val="1"/>
+                <w:sz w:val="20"/>
+                <w:szCs w:val="20"/>
+              </w:rPr>
+            </w:pPr>
+            <w:r>
+              <w:rPr>
+                <w:rFonts w:ascii="Arial" w:cs="Arial" w:eastAsia="Arial" w:hAnsi="Arial"/>
+                <w:sz w:val="20"/>
+                <w:szCs w:val="20"/>
+                <w:rtl w:val="0"/>
+              </w:rPr>
+              <w:t xml:space="preserve">O repositório e o código-fonte estão disponíveis no GitHub: </w:t>
+            </w:r>
+            <w:hyperlink r:id="rId6">
+              <w:r>
+                <w:rPr>
+                  <w:rFonts w:ascii="Arial" w:cs="Arial" w:eastAsia="Arial" w:hAnsi="Arial"/>
+                  <w:color w:val="1155cc"/>
+                  <w:sz w:val="20"/>
+                  <w:szCs w:val="20"/>
+                  <w:u w:val="single"/>
+                  <w:rtl w:val="0"/>
+                </w:rPr>
+                <w:t xml:space="preserve">https://github.com/2026-1-NCC3/Projeto3</w:t>
+              </w:r>
+            </w:hyperlink>
             <w:r>
               <w:rPr>
                 <w:rtl w:val="0"/>
@@ -1712,6 +1741,23 @@
       </w:pPr>
       <w:r>
         <w:rPr>
+          <w:rtl w:val="0"/>
+        </w:rPr>
+      </w:r>
+    </w:p>
+    <w:p>
+      <w:pPr>
+        <w:spacing w:after="0" w:line="240" w:lineRule="auto"/>
+        <w:rPr>
+          <w:rFonts w:ascii="Arial" w:cs="Arial" w:eastAsia="Arial" w:hAnsi="Arial"/>
+          <w:b w:val="1"/>
+          <w:bCs w:val="1"/>
+          <w:sz w:val="20"/>
+          <w:szCs w:val="20"/>
+        </w:rPr>
+      </w:pPr>
+      <w:r>
+        <w:rPr>
           <w:rFonts w:ascii="Arial" w:cs="Arial" w:eastAsia="Arial" w:hAnsi="Arial"/>
           <w:b w:val="1"/>
           <w:bCs w:val="1"/>
@@ -1720,6 +1766,23 @@
           <w:rtl w:val="0"/>
         </w:rPr>
         <w:t xml:space="preserve">2. IDENTIFICAÇÃO DO CENÁRIO DE INTERVENÇÃO E HIPÓTESES DE SOLUÇÃO</w:t>
+      </w:r>
+    </w:p>
+    <w:p>
+      <w:pPr>
+        <w:spacing w:after="0" w:line="240" w:lineRule="auto"/>
+        <w:rPr>
+          <w:rFonts w:ascii="Arial" w:cs="Arial" w:eastAsia="Arial" w:hAnsi="Arial"/>
+          <w:b w:val="1"/>
+          <w:bCs w:val="1"/>
+          <w:sz w:val="20"/>
+          <w:szCs w:val="20"/>
+        </w:rPr>
+      </w:pPr>
+      <w:r>
+        <w:rPr>
+          <w:rtl w:val="0"/>
+        </w:rPr>
       </w:r>
     </w:p>
     <w:p>
@@ -1770,7 +1833,7 @@
       <w:tr>
         <w:trPr>
           <w:cantSplit w:val="0"/>
-          <w:trHeight w:val="564.9609375" w:hRule="atLeast"/>
+          <w:trHeight w:val="809.94140625" w:hRule="atLeast"/>
           <w:tblHeader w:val="0"/>
         </w:trPr>
         <w:tc>
@@ -1781,22 +1844,30 @@
               <w:bottom w:color="000000" w:space="0" w:sz="4" w:val="single"/>
               <w:right w:color="000000" w:space="0" w:sz="4" w:val="single"/>
             </w:tcBorders>
-            <w:shd w:fill="auto" w:val="clear"/>
           </w:tcPr>
           <w:p>
             <w:pPr>
-              <w:pBdr>
-                <w:top w:space="0" w:sz="0" w:val="nil"/>
-                <w:left w:space="0" w:sz="0" w:val="nil"/>
-                <w:bottom w:space="0" w:sz="0" w:val="nil"/>
-                <w:right w:space="0" w:sz="0" w:val="nil"/>
-                <w:between w:space="0" w:sz="0" w:val="nil"/>
-              </w:pBdr>
               <w:spacing w:after="0" w:line="240" w:lineRule="auto"/>
               <w:jc w:val="both"/>
               <w:rPr>
                 <w:rFonts w:ascii="Arial" w:cs="Arial" w:eastAsia="Arial" w:hAnsi="Arial"/>
-                <w:color w:val="525252"/>
+                <w:sz w:val="20"/>
+                <w:szCs w:val="20"/>
+              </w:rPr>
+            </w:pPr>
+            <w:r>
+              <w:rPr>
+                <w:rtl w:val="0"/>
+              </w:rPr>
+            </w:r>
+          </w:p>
+          <w:p>
+            <w:pPr>
+              <w:spacing w:after="0" w:line="240" w:lineRule="auto"/>
+              <w:jc w:val="both"/>
+              <w:rPr>
+                <w:rFonts w:ascii="Arial" w:cs="Arial" w:eastAsia="Arial" w:hAnsi="Arial"/>
+                <w:color w:val="ff3333"/>
                 <w:sz w:val="20"/>
                 <w:szCs w:val="20"/>
               </w:rPr>
@@ -1884,7 +1955,7 @@
       <w:tr>
         <w:trPr>
           <w:cantSplit w:val="0"/>
-          <w:trHeight w:val="979.921875" w:hRule="atLeast"/>
+          <w:trHeight w:val="1299.90234375" w:hRule="atLeast"/>
           <w:tblHeader w:val="0"/>
         </w:trPr>
         <w:tc>
@@ -1895,7 +1966,6 @@
               <w:bottom w:color="000000" w:space="0" w:sz="4" w:val="single"/>
               <w:right w:color="000000" w:space="0" w:sz="4" w:val="single"/>
             </w:tcBorders>
-            <w:shd w:fill="auto" w:val="clear"/>
           </w:tcPr>
           <w:p>
             <w:pPr>
@@ -1910,7 +1980,24 @@
               <w:jc w:val="both"/>
               <w:rPr>
                 <w:rFonts w:ascii="Arial" w:cs="Arial" w:eastAsia="Arial" w:hAnsi="Arial"/>
-                <w:color w:val="525252"/>
+                <w:color w:val="0c3512"/>
+                <w:sz w:val="20"/>
+                <w:szCs w:val="20"/>
+              </w:rPr>
+            </w:pPr>
+            <w:r>
+              <w:rPr>
+                <w:rtl w:val="0"/>
+              </w:rPr>
+            </w:r>
+          </w:p>
+          <w:p>
+            <w:pPr>
+              <w:spacing w:after="0" w:line="240" w:lineRule="auto"/>
+              <w:jc w:val="both"/>
+              <w:rPr>
+                <w:rFonts w:ascii="Arial" w:cs="Arial" w:eastAsia="Arial" w:hAnsi="Arial"/>
+                <w:color w:val="0c3512"/>
                 <w:sz w:val="20"/>
                 <w:szCs w:val="20"/>
               </w:rPr>
@@ -1992,7 +2079,7 @@
       <w:tr>
         <w:trPr>
           <w:cantSplit w:val="0"/>
-          <w:trHeight w:val="1009.921875" w:hRule="atLeast"/>
+          <w:trHeight w:val="1529.8828125" w:hRule="atLeast"/>
           <w:tblHeader w:val="0"/>
         </w:trPr>
         <w:tc>
@@ -2007,13 +2094,22 @@
           </w:tcPr>
           <w:p>
             <w:pPr>
-              <w:pBdr>
-                <w:top w:space="0" w:sz="0" w:val="nil"/>
-                <w:left w:space="0" w:sz="0" w:val="nil"/>
-                <w:bottom w:space="0" w:sz="0" w:val="nil"/>
-                <w:right w:space="0" w:sz="0" w:val="nil"/>
-                <w:between w:space="0" w:sz="0" w:val="nil"/>
-              </w:pBdr>
+              <w:spacing w:after="0" w:line="240" w:lineRule="auto"/>
+              <w:jc w:val="both"/>
+              <w:rPr>
+                <w:rFonts w:ascii="Arial" w:cs="Arial" w:eastAsia="Arial" w:hAnsi="Arial"/>
+                <w:sz w:val="20"/>
+                <w:szCs w:val="20"/>
+              </w:rPr>
+            </w:pPr>
+            <w:r>
+              <w:rPr>
+                <w:rtl w:val="0"/>
+              </w:rPr>
+            </w:r>
+          </w:p>
+          <w:p>
+            <w:pPr>
               <w:spacing w:after="0" w:line="240" w:lineRule="auto"/>
               <w:jc w:val="both"/>
               <w:rPr>
@@ -2100,7 +2196,7 @@
       <w:tr>
         <w:trPr>
           <w:cantSplit w:val="0"/>
-          <w:trHeight w:val="1260" w:hRule="atLeast"/>
+          <w:trHeight w:val="1619.8828125" w:hRule="atLeast"/>
           <w:tblHeader w:val="0"/>
         </w:trPr>
         <w:tc>
@@ -2111,22 +2207,30 @@
               <w:bottom w:color="000000" w:space="0" w:sz="4" w:val="single"/>
               <w:right w:color="000000" w:space="0" w:sz="4" w:val="single"/>
             </w:tcBorders>
-            <w:shd w:fill="auto" w:val="clear"/>
           </w:tcPr>
           <w:p>
             <w:pPr>
-              <w:pBdr>
-                <w:top w:space="0" w:sz="0" w:val="nil"/>
-                <w:left w:space="0" w:sz="0" w:val="nil"/>
-                <w:bottom w:space="0" w:sz="0" w:val="nil"/>
-                <w:right w:space="0" w:sz="0" w:val="nil"/>
-                <w:between w:space="0" w:sz="0" w:val="nil"/>
-              </w:pBdr>
               <w:spacing w:after="0" w:line="240" w:lineRule="auto"/>
               <w:jc w:val="both"/>
               <w:rPr>
                 <w:rFonts w:ascii="Arial" w:cs="Arial" w:eastAsia="Arial" w:hAnsi="Arial"/>
-                <w:color w:val="525252"/>
+                <w:sz w:val="20"/>
+                <w:szCs w:val="20"/>
+              </w:rPr>
+            </w:pPr>
+            <w:r>
+              <w:rPr>
+                <w:rtl w:val="0"/>
+              </w:rPr>
+            </w:r>
+          </w:p>
+          <w:p>
+            <w:pPr>
+              <w:spacing w:after="0" w:line="240" w:lineRule="auto"/>
+              <w:jc w:val="both"/>
+              <w:rPr>
+                <w:rFonts w:ascii="Arial" w:cs="Arial" w:eastAsia="Arial" w:hAnsi="Arial"/>
+                <w:color w:val="ff3333"/>
                 <w:sz w:val="20"/>
                 <w:szCs w:val="20"/>
               </w:rPr>
@@ -2149,125 +2253,6 @@
         </w:tc>
       </w:tr>
     </w:tbl>
-    <w:p>
-      <w:pPr>
-        <w:spacing w:after="0" w:line="240" w:lineRule="auto"/>
-        <w:rPr>
-          <w:rFonts w:ascii="Arial" w:cs="Arial" w:eastAsia="Arial" w:hAnsi="Arial"/>
-          <w:b w:val="1"/>
-          <w:bCs w:val="1"/>
-          <w:sz w:val="20"/>
-          <w:szCs w:val="20"/>
-        </w:rPr>
-      </w:pPr>
-      <w:r>
-        <w:rPr>
-          <w:rtl w:val="0"/>
-        </w:rPr>
-      </w:r>
-    </w:p>
-    <w:p>
-      <w:pPr>
-        <w:spacing w:after="0" w:line="240" w:lineRule="auto"/>
-        <w:rPr>
-          <w:rFonts w:ascii="Arial" w:cs="Arial" w:eastAsia="Arial" w:hAnsi="Arial"/>
-          <w:b w:val="1"/>
-          <w:bCs w:val="1"/>
-          <w:sz w:val="20"/>
-          <w:szCs w:val="20"/>
-        </w:rPr>
-      </w:pPr>
-      <w:r>
-        <w:rPr>
-          <w:rtl w:val="0"/>
-        </w:rPr>
-      </w:r>
-    </w:p>
-    <w:p>
-      <w:pPr>
-        <w:spacing w:after="0" w:line="240" w:lineRule="auto"/>
-        <w:rPr>
-          <w:rFonts w:ascii="Arial" w:cs="Arial" w:eastAsia="Arial" w:hAnsi="Arial"/>
-          <w:b w:val="1"/>
-          <w:bCs w:val="1"/>
-          <w:sz w:val="20"/>
-          <w:szCs w:val="20"/>
-        </w:rPr>
-      </w:pPr>
-      <w:r>
-        <w:rPr>
-          <w:rtl w:val="0"/>
-        </w:rPr>
-      </w:r>
-    </w:p>
-    <w:p>
-      <w:pPr>
-        <w:spacing w:after="0" w:line="240" w:lineRule="auto"/>
-        <w:rPr>
-          <w:rFonts w:ascii="Arial" w:cs="Arial" w:eastAsia="Arial" w:hAnsi="Arial"/>
-          <w:b w:val="1"/>
-          <w:bCs w:val="1"/>
-          <w:sz w:val="20"/>
-          <w:szCs w:val="20"/>
-        </w:rPr>
-      </w:pPr>
-      <w:r>
-        <w:rPr>
-          <w:rtl w:val="0"/>
-        </w:rPr>
-      </w:r>
-    </w:p>
-    <w:p>
-      <w:pPr>
-        <w:spacing w:after="0" w:line="240" w:lineRule="auto"/>
-        <w:rPr>
-          <w:rFonts w:ascii="Arial" w:cs="Arial" w:eastAsia="Arial" w:hAnsi="Arial"/>
-          <w:b w:val="1"/>
-          <w:bCs w:val="1"/>
-          <w:sz w:val="20"/>
-          <w:szCs w:val="20"/>
-        </w:rPr>
-      </w:pPr>
-      <w:r>
-        <w:rPr>
-          <w:rtl w:val="0"/>
-        </w:rPr>
-      </w:r>
-    </w:p>
-    <w:p>
-      <w:pPr>
-        <w:spacing w:after="0" w:line="240" w:lineRule="auto"/>
-        <w:rPr>
-          <w:rFonts w:ascii="Arial" w:cs="Arial" w:eastAsia="Arial" w:hAnsi="Arial"/>
-          <w:b w:val="1"/>
-          <w:bCs w:val="1"/>
-          <w:sz w:val="20"/>
-          <w:szCs w:val="20"/>
-        </w:rPr>
-      </w:pPr>
-      <w:r>
-        <w:rPr>
-          <w:rtl w:val="0"/>
-        </w:rPr>
-      </w:r>
-    </w:p>
-    <w:p>
-      <w:pPr>
-        <w:spacing w:after="0" w:line="240" w:lineRule="auto"/>
-        <w:rPr>
-          <w:rFonts w:ascii="Arial" w:cs="Arial" w:eastAsia="Arial" w:hAnsi="Arial"/>
-          <w:b w:val="1"/>
-          <w:bCs w:val="1"/>
-          <w:sz w:val="20"/>
-          <w:szCs w:val="20"/>
-        </w:rPr>
-      </w:pPr>
-      <w:r>
-        <w:rPr>
-          <w:rtl w:val="0"/>
-        </w:rPr>
-      </w:r>
-    </w:p>
     <w:p>
       <w:pPr>
         <w:spacing w:after="0" w:line="240" w:lineRule="auto"/>
@@ -2363,7 +2348,7 @@
           <w:rFonts w:ascii="Arial" w:cs="Arial" w:eastAsia="Arial" w:hAnsi="Arial"/>
           <w:b w:val="1"/>
           <w:bCs w:val="1"/>
-          <w:color w:val="525252"/>
+          <w:color w:val="0c3512"/>
           <w:sz w:val="16"/>
           <w:szCs w:val="16"/>
         </w:rPr>
@@ -2373,7 +2358,7 @@
           <w:rFonts w:ascii="Arial" w:cs="Arial" w:eastAsia="Arial" w:hAnsi="Arial"/>
           <w:b w:val="1"/>
           <w:bCs w:val="1"/>
-          <w:color w:val="525252"/>
+          <w:color w:val="0c3512"/>
           <w:sz w:val="16"/>
           <w:szCs w:val="16"/>
           <w:rtl w:val="0"/>
@@ -2442,7 +2427,7 @@
       <w:tr>
         <w:trPr>
           <w:cantSplit w:val="0"/>
-          <w:trHeight w:val="1424.8828125" w:hRule="atLeast"/>
+          <w:trHeight w:val="1729.86328125" w:hRule="atLeast"/>
           <w:tblHeader w:val="0"/>
         </w:trPr>
         <w:tc>
@@ -2453,7 +2438,6 @@
               <w:bottom w:color="000000" w:space="0" w:sz="4" w:val="single"/>
               <w:right w:color="000000" w:space="0" w:sz="4" w:val="single"/>
             </w:tcBorders>
-            <w:shd w:fill="auto" w:val="clear"/>
           </w:tcPr>
           <w:p>
             <w:pPr>
@@ -2461,7 +2445,23 @@
               <w:jc w:val="both"/>
               <w:rPr>
                 <w:rFonts w:ascii="Arial" w:cs="Arial" w:eastAsia="Arial" w:hAnsi="Arial"/>
-                <w:color w:val="525252"/>
+                <w:sz w:val="20"/>
+                <w:szCs w:val="20"/>
+              </w:rPr>
+            </w:pPr>
+            <w:r>
+              <w:rPr>
+                <w:rtl w:val="0"/>
+              </w:rPr>
+            </w:r>
+          </w:p>
+          <w:p>
+            <w:pPr>
+              <w:spacing w:after="0" w:line="240" w:lineRule="auto"/>
+              <w:jc w:val="both"/>
+              <w:rPr>
+                <w:rFonts w:ascii="Arial" w:cs="Arial" w:eastAsia="Arial" w:hAnsi="Arial"/>
+                <w:color w:val="000000"/>
                 <w:sz w:val="20"/>
                 <w:szCs w:val="20"/>
               </w:rPr>
@@ -2584,7 +2584,7 @@
       <w:tr>
         <w:trPr>
           <w:cantSplit w:val="0"/>
-          <w:trHeight w:val="1009.921875" w:hRule="atLeast"/>
+          <w:trHeight w:val="1374.90234375" w:hRule="atLeast"/>
           <w:tblHeader w:val="0"/>
         </w:trPr>
         <w:tc>
@@ -2595,7 +2595,6 @@
               <w:bottom w:color="000000" w:space="0" w:sz="4" w:val="single"/>
               <w:right w:color="000000" w:space="0" w:sz="4" w:val="single"/>
             </w:tcBorders>
-            <w:shd w:fill="auto" w:val="clear"/>
           </w:tcPr>
           <w:p>
             <w:pPr>
@@ -2603,7 +2602,22 @@
               <w:jc w:val="both"/>
               <w:rPr>
                 <w:rFonts w:ascii="Arial" w:cs="Arial" w:eastAsia="Arial" w:hAnsi="Arial"/>
-                <w:color w:val="525252"/>
+                <w:sz w:val="20"/>
+                <w:szCs w:val="20"/>
+              </w:rPr>
+            </w:pPr>
+            <w:r>
+              <w:rPr>
+                <w:rtl w:val="0"/>
+              </w:rPr>
+            </w:r>
+          </w:p>
+          <w:p>
+            <w:pPr>
+              <w:spacing w:after="0" w:line="240" w:lineRule="auto"/>
+              <w:jc w:val="both"/>
+              <w:rPr>
+                <w:rFonts w:ascii="Arial" w:cs="Arial" w:eastAsia="Arial" w:hAnsi="Arial"/>
                 <w:sz w:val="20"/>
                 <w:szCs w:val="20"/>
               </w:rPr>
@@ -2634,11 +2648,6 @@
                 <w:rtl w:val="0"/>
               </w:rPr>
               <w:t xml:space="preserve"> surge para modernizar essa gestão, combatendo a ineficiência e garantindo que as diretrizes do tratamento de RPG sigam o paciente em sua rotina.</w:t>
-            </w:r>
-            <w:r>
-              <w:rPr>
-                <w:rtl w:val="0"/>
-              </w:rPr>
             </w:r>
           </w:p>
         </w:tc>
@@ -2703,7 +2712,7 @@
       <w:tr>
         <w:trPr>
           <w:cantSplit w:val="0"/>
-          <w:trHeight w:val="1024.921875" w:hRule="atLeast"/>
+          <w:trHeight w:val="1374.90234375" w:hRule="atLeast"/>
           <w:tblHeader w:val="0"/>
         </w:trPr>
         <w:tc>
@@ -2714,25 +2723,43 @@
               <w:bottom w:color="000000" w:space="0" w:sz="4" w:val="single"/>
               <w:right w:color="000000" w:space="0" w:sz="4" w:val="single"/>
             </w:tcBorders>
-            <w:shd w:fill="auto" w:val="clear"/>
           </w:tcPr>
+          <w:p>
+            <w:pPr>
+              <w:tabs>
+                <w:tab w:val="left" w:leader="none" w:pos="360"/>
+              </w:tabs>
+              <w:spacing w:after="0" w:line="240" w:lineRule="auto"/>
+              <w:ind w:left="0" w:firstLine="0"/>
+              <w:jc w:val="both"/>
+              <w:rPr>
+                <w:rFonts w:ascii="Arial" w:cs="Arial" w:eastAsia="Arial" w:hAnsi="Arial"/>
+                <w:sz w:val="20"/>
+                <w:szCs w:val="20"/>
+              </w:rPr>
+            </w:pPr>
+            <w:r>
+              <w:rPr>
+                <w:rtl w:val="0"/>
+              </w:rPr>
+            </w:r>
+          </w:p>
           <w:p>
             <w:pPr>
               <w:numPr>
                 <w:ilvl w:val="0"/>
-                <w:numId w:val="1"/>
+                <w:numId w:val="2"/>
               </w:numPr>
               <w:tabs>
                 <w:tab w:val="left" w:leader="none" w:pos="360"/>
               </w:tabs>
-              <w:spacing w:after="0" w:line="240" w:lineRule="auto"/>
+              <w:spacing w:after="200" w:line="240" w:lineRule="auto"/>
               <w:ind w:left="720" w:hanging="360"/>
               <w:jc w:val="both"/>
               <w:rPr>
                 <w:rFonts w:ascii="Arial" w:cs="Arial" w:eastAsia="Arial" w:hAnsi="Arial"/>
                 <w:sz w:val="20"/>
                 <w:szCs w:val="20"/>
-                <w:u w:val="none"/>
               </w:rPr>
             </w:pPr>
             <w:r>
@@ -2749,19 +2776,18 @@
             <w:pPr>
               <w:numPr>
                 <w:ilvl w:val="0"/>
-                <w:numId w:val="1"/>
+                <w:numId w:val="2"/>
               </w:numPr>
               <w:tabs>
                 <w:tab w:val="left" w:leader="none" w:pos="360"/>
               </w:tabs>
-              <w:spacing w:after="0" w:line="240" w:lineRule="auto"/>
+              <w:spacing w:after="200" w:before="0" w:line="240" w:lineRule="auto"/>
               <w:ind w:left="720" w:hanging="360"/>
               <w:jc w:val="both"/>
               <w:rPr>
                 <w:rFonts w:ascii="Arial" w:cs="Arial" w:eastAsia="Arial" w:hAnsi="Arial"/>
                 <w:sz w:val="20"/>
                 <w:szCs w:val="20"/>
-                <w:u w:val="none"/>
               </w:rPr>
             </w:pPr>
             <w:r>
@@ -2778,19 +2804,18 @@
             <w:pPr>
               <w:numPr>
                 <w:ilvl w:val="0"/>
-                <w:numId w:val="1"/>
+                <w:numId w:val="2"/>
               </w:numPr>
               <w:tabs>
                 <w:tab w:val="left" w:leader="none" w:pos="360"/>
               </w:tabs>
-              <w:spacing w:after="0" w:line="240" w:lineRule="auto"/>
+              <w:spacing w:after="200" w:line="240" w:lineRule="auto"/>
               <w:ind w:left="720" w:hanging="360"/>
               <w:jc w:val="both"/>
               <w:rPr>
                 <w:rFonts w:ascii="Arial" w:cs="Arial" w:eastAsia="Arial" w:hAnsi="Arial"/>
                 <w:sz w:val="20"/>
                 <w:szCs w:val="20"/>
-                <w:u w:val="none"/>
               </w:rPr>
             </w:pPr>
             <w:r>
@@ -2871,7 +2896,7 @@
       <w:tr>
         <w:trPr>
           <w:cantSplit w:val="0"/>
-          <w:trHeight w:val="1224.9023437499998" w:hRule="atLeast"/>
+          <w:trHeight w:val="1559.8828125" w:hRule="atLeast"/>
           <w:tblHeader w:val="0"/>
         </w:trPr>
         <w:tc>
@@ -2882,7 +2907,6 @@
               <w:bottom w:color="000000" w:space="0" w:sz="4" w:val="single"/>
               <w:right w:color="000000" w:space="0" w:sz="4" w:val="single"/>
             </w:tcBorders>
-            <w:shd w:fill="auto" w:val="clear"/>
           </w:tcPr>
           <w:p>
             <w:pPr>
@@ -2890,7 +2914,24 @@
               <w:jc w:val="both"/>
               <w:rPr>
                 <w:rFonts w:ascii="Arial" w:cs="Arial" w:eastAsia="Arial" w:hAnsi="Arial"/>
-                <w:color w:val="525252"/>
+                <w:color w:val="0c3512"/>
+                <w:sz w:val="20"/>
+                <w:szCs w:val="20"/>
+              </w:rPr>
+            </w:pPr>
+            <w:r>
+              <w:rPr>
+                <w:rtl w:val="0"/>
+              </w:rPr>
+            </w:r>
+          </w:p>
+          <w:p>
+            <w:pPr>
+              <w:spacing w:after="0" w:line="240" w:lineRule="auto"/>
+              <w:jc w:val="both"/>
+              <w:rPr>
+                <w:rFonts w:ascii="Arial" w:cs="Arial" w:eastAsia="Arial" w:hAnsi="Arial"/>
+                <w:color w:val="0c3512"/>
                 <w:sz w:val="20"/>
                 <w:szCs w:val="20"/>
               </w:rPr>
@@ -2974,7 +3015,7 @@
       <w:tr>
         <w:trPr>
           <w:cantSplit w:val="0"/>
-          <w:trHeight w:val="1254.9023437499998" w:hRule="atLeast"/>
+          <w:trHeight w:val="1529.8828125" w:hRule="atLeast"/>
           <w:tblHeader w:val="0"/>
         </w:trPr>
         <w:tc>
@@ -2985,7 +3026,6 @@
               <w:bottom w:color="000000" w:space="0" w:sz="4" w:val="single"/>
               <w:right w:color="000000" w:space="0" w:sz="4" w:val="single"/>
             </w:tcBorders>
-            <w:shd w:fill="auto" w:val="clear"/>
           </w:tcPr>
           <w:p>
             <w:pPr>
@@ -2993,7 +3033,24 @@
               <w:jc w:val="both"/>
               <w:rPr>
                 <w:rFonts w:ascii="Arial" w:cs="Arial" w:eastAsia="Arial" w:hAnsi="Arial"/>
-                <w:color w:val="525252"/>
+                <w:color w:val="0c3512"/>
+                <w:sz w:val="20"/>
+                <w:szCs w:val="20"/>
+              </w:rPr>
+            </w:pPr>
+            <w:r>
+              <w:rPr>
+                <w:rtl w:val="0"/>
+              </w:rPr>
+            </w:r>
+          </w:p>
+          <w:p>
+            <w:pPr>
+              <w:spacing w:after="0" w:line="240" w:lineRule="auto"/>
+              <w:jc w:val="both"/>
+              <w:rPr>
+                <w:rFonts w:ascii="Arial" w:cs="Arial" w:eastAsia="Arial" w:hAnsi="Arial"/>
+                <w:color w:val="0c3512"/>
                 <w:sz w:val="20"/>
                 <w:szCs w:val="20"/>
               </w:rPr>
@@ -3078,7 +3135,7 @@
       <w:tr>
         <w:trPr>
           <w:cantSplit w:val="0"/>
-          <w:trHeight w:val="994.921875" w:hRule="atLeast"/>
+          <w:trHeight w:val="1359.90234375" w:hRule="atLeast"/>
           <w:tblHeader w:val="0"/>
         </w:trPr>
         <w:tc>
@@ -3089,7 +3146,6 @@
               <w:bottom w:color="000000" w:space="0" w:sz="4" w:val="single"/>
               <w:right w:color="000000" w:space="0" w:sz="4" w:val="single"/>
             </w:tcBorders>
-            <w:shd w:fill="auto" w:val="clear"/>
           </w:tcPr>
           <w:p>
             <w:pPr>
@@ -3100,7 +3156,27 @@
               <w:jc w:val="both"/>
               <w:rPr>
                 <w:rFonts w:ascii="Arial" w:cs="Arial" w:eastAsia="Arial" w:hAnsi="Arial"/>
-                <w:color w:val="525252"/>
+                <w:color w:val="0c3512"/>
+                <w:sz w:val="20"/>
+                <w:szCs w:val="20"/>
+              </w:rPr>
+            </w:pPr>
+            <w:r>
+              <w:rPr>
+                <w:rtl w:val="0"/>
+              </w:rPr>
+            </w:r>
+          </w:p>
+          <w:p>
+            <w:pPr>
+              <w:tabs>
+                <w:tab w:val="left" w:leader="none" w:pos="360"/>
+              </w:tabs>
+              <w:spacing w:after="0" w:line="240" w:lineRule="auto"/>
+              <w:jc w:val="both"/>
+              <w:rPr>
+                <w:rFonts w:ascii="Arial" w:cs="Arial" w:eastAsia="Arial" w:hAnsi="Arial"/>
+                <w:color w:val="0c3512"/>
                 <w:sz w:val="20"/>
                 <w:szCs w:val="20"/>
               </w:rPr>
@@ -3143,6 +3219,641 @@
         <w:spacing w:after="0" w:line="240" w:lineRule="auto"/>
         <w:rPr>
           <w:rFonts w:ascii="Arial" w:cs="Arial" w:eastAsia="Arial" w:hAnsi="Arial"/>
+          <w:b w:val="1"/>
+          <w:bCs w:val="1"/>
+          <w:sz w:val="20"/>
+          <w:szCs w:val="20"/>
+        </w:rPr>
+      </w:pPr>
+      <w:r>
+        <w:br w:type="page"/>
+      </w:r>
+      <w:r>
+        <w:rPr>
+          <w:rtl w:val="0"/>
+        </w:rPr>
+      </w:r>
+    </w:p>
+    <w:p>
+      <w:pPr>
+        <w:spacing w:after="0" w:line="240" w:lineRule="auto"/>
+        <w:rPr>
+          <w:rFonts w:ascii="Arial" w:cs="Arial" w:eastAsia="Arial" w:hAnsi="Arial"/>
+          <w:b w:val="1"/>
+          <w:bCs w:val="1"/>
+          <w:sz w:val="20"/>
+          <w:szCs w:val="20"/>
+        </w:rPr>
+      </w:pPr>
+      <w:r>
+        <w:rPr>
+          <w:rFonts w:ascii="Arial" w:cs="Arial" w:eastAsia="Arial" w:hAnsi="Arial"/>
+          <w:b w:val="1"/>
+          <w:bCs w:val="1"/>
+          <w:sz w:val="20"/>
+          <w:szCs w:val="20"/>
+          <w:rtl w:val="0"/>
+        </w:rPr>
+        <w:t xml:space="preserve">Referências </w:t>
+      </w:r>
+    </w:p>
+    <w:tbl>
+      <w:tblPr>
+        <w:tblStyle w:val="Table19"/>
+        <w:tblW w:w="9345.0" w:type="dxa"/>
+        <w:jc w:val="left"/>
+        <w:tblLayout w:type="fixed"/>
+        <w:tblLook w:val="0000"/>
+      </w:tblPr>
+      <w:tblGrid>
+        <w:gridCol w:w="9345"/>
+        <w:tblGridChange w:id="0">
+          <w:tblGrid>
+            <w:gridCol w:w="9345"/>
+          </w:tblGrid>
+        </w:tblGridChange>
+      </w:tblGrid>
+      <w:tr>
+        <w:trPr>
+          <w:cantSplit w:val="0"/>
+          <w:tblHeader w:val="0"/>
+        </w:trPr>
+        <w:tc>
+          <w:tcPr>
+            <w:tcBorders>
+              <w:top w:color="000000" w:space="0" w:sz="4" w:val="single"/>
+              <w:left w:color="000000" w:space="0" w:sz="4" w:val="single"/>
+              <w:bottom w:color="000000" w:space="0" w:sz="4" w:val="single"/>
+              <w:right w:color="000000" w:space="0" w:sz="4" w:val="single"/>
+            </w:tcBorders>
+          </w:tcPr>
+          <w:p>
+            <w:pPr>
+              <w:spacing w:after="0" w:line="240" w:lineRule="auto"/>
+              <w:rPr>
+                <w:rFonts w:ascii="Arial" w:cs="Arial" w:eastAsia="Arial" w:hAnsi="Arial"/>
+                <w:color w:val="0c3512"/>
+                <w:sz w:val="20"/>
+                <w:szCs w:val="20"/>
+              </w:rPr>
+            </w:pPr>
+            <w:r>
+              <w:rPr>
+                <w:rtl w:val="0"/>
+              </w:rPr>
+            </w:r>
+          </w:p>
+          <w:p>
+            <w:pPr>
+              <w:spacing w:after="0" w:line="240" w:lineRule="auto"/>
+              <w:rPr>
+                <w:rFonts w:ascii="Arial" w:cs="Arial" w:eastAsia="Arial" w:hAnsi="Arial"/>
+                <w:color w:val="0c3512"/>
+                <w:sz w:val="20"/>
+                <w:szCs w:val="20"/>
+              </w:rPr>
+            </w:pPr>
+            <w:r>
+              <w:rPr>
+                <w:rFonts w:ascii="Arial" w:cs="Arial" w:eastAsia="Arial" w:hAnsi="Arial"/>
+                <w:color w:val="0c3512"/>
+                <w:sz w:val="20"/>
+                <w:szCs w:val="20"/>
+                <w:rtl w:val="0"/>
+              </w:rPr>
+              <w:t xml:space="preserve">CONSELHO FEDERAL DE FISIOTERAPIA E TERAPIA OCUPACIONAL (COFFITO). Resolução nº 414, de 19 de janeiro de 2012. Dispõe sobre a obrigatoriedade do registro em prontuário pelo fisioterapeuta. Brasília: COFFITO, 2012.</w:t>
+            </w:r>
+          </w:p>
+          <w:p>
+            <w:pPr>
+              <w:spacing w:after="0" w:line="240" w:lineRule="auto"/>
+              <w:rPr>
+                <w:rFonts w:ascii="Arial" w:cs="Arial" w:eastAsia="Arial" w:hAnsi="Arial"/>
+                <w:color w:val="0c3512"/>
+                <w:sz w:val="20"/>
+                <w:szCs w:val="20"/>
+              </w:rPr>
+            </w:pPr>
+            <w:r>
+              <w:rPr>
+                <w:rtl w:val="0"/>
+              </w:rPr>
+            </w:r>
+          </w:p>
+          <w:p>
+            <w:pPr>
+              <w:spacing w:after="0" w:line="240" w:lineRule="auto"/>
+              <w:rPr>
+                <w:rFonts w:ascii="Arial" w:cs="Arial" w:eastAsia="Arial" w:hAnsi="Arial"/>
+                <w:color w:val="0c3512"/>
+                <w:sz w:val="20"/>
+                <w:szCs w:val="20"/>
+              </w:rPr>
+            </w:pPr>
+            <w:r>
+              <w:rPr>
+                <w:rFonts w:ascii="Arial" w:cs="Arial" w:eastAsia="Arial" w:hAnsi="Arial"/>
+                <w:color w:val="0c3512"/>
+                <w:sz w:val="20"/>
+                <w:szCs w:val="20"/>
+                <w:rtl w:val="0"/>
+              </w:rPr>
+              <w:t xml:space="preserve">TEIXEIRA, R. C.; FREITAS, E. S. P.</w:t>
+            </w:r>
+            <w:r>
+              <w:rPr>
+                <w:rFonts w:ascii="Arial" w:cs="Arial" w:eastAsia="Arial" w:hAnsi="Arial"/>
+                <w:color w:val="0c3512"/>
+                <w:sz w:val="20"/>
+                <w:szCs w:val="20"/>
+                <w:rtl w:val="0"/>
+              </w:rPr>
+              <w:t xml:space="preserve">; JUNIOR</w:t>
+            </w:r>
+            <w:r>
+              <w:rPr>
+                <w:rFonts w:ascii="Arial" w:cs="Arial" w:eastAsia="Arial" w:hAnsi="Arial"/>
+                <w:color w:val="0c3512"/>
+                <w:sz w:val="20"/>
+                <w:szCs w:val="20"/>
+                <w:rtl w:val="0"/>
+              </w:rPr>
+              <w:t xml:space="preserve">, L. C. S. C. Aplicativo móvel como coadjuvante na adesão ao tratamento fisioterapêutico. Fisioterapia Brasil, v. 25, n. 4, p. 1565-1576, 2024.</w:t>
+            </w:r>
+          </w:p>
+          <w:p>
+            <w:pPr>
+              <w:spacing w:after="0" w:line="240" w:lineRule="auto"/>
+              <w:rPr>
+                <w:rFonts w:ascii="Arial" w:cs="Arial" w:eastAsia="Arial" w:hAnsi="Arial"/>
+                <w:color w:val="0c3512"/>
+                <w:sz w:val="20"/>
+                <w:szCs w:val="20"/>
+              </w:rPr>
+            </w:pPr>
+            <w:r>
+              <w:rPr>
+                <w:rtl w:val="0"/>
+              </w:rPr>
+            </w:r>
+          </w:p>
+        </w:tc>
+      </w:tr>
+    </w:tbl>
+    <w:p>
+      <w:pPr>
+        <w:spacing w:after="0" w:line="240" w:lineRule="auto"/>
+        <w:jc w:val="left"/>
+        <w:rPr>
+          <w:rFonts w:ascii="Arial" w:cs="Arial" w:eastAsia="Arial" w:hAnsi="Arial"/>
+          <w:b w:val="1"/>
+          <w:bCs w:val="1"/>
+          <w:sz w:val="20"/>
+          <w:szCs w:val="20"/>
+        </w:rPr>
+      </w:pPr>
+      <w:r>
+        <w:rPr>
+          <w:rtl w:val="0"/>
+        </w:rPr>
+      </w:r>
+    </w:p>
+    <w:p>
+      <w:pPr>
+        <w:spacing w:after="0" w:line="240" w:lineRule="auto"/>
+        <w:jc w:val="center"/>
+        <w:rPr>
+          <w:rFonts w:ascii="Arial" w:cs="Arial" w:eastAsia="Arial" w:hAnsi="Arial"/>
+          <w:b w:val="1"/>
+          <w:bCs w:val="1"/>
+          <w:sz w:val="20"/>
+          <w:szCs w:val="20"/>
+        </w:rPr>
+      </w:pPr>
+      <w:r>
+        <w:rPr>
+          <w:rtl w:val="0"/>
+        </w:rPr>
+      </w:r>
+    </w:p>
+    <w:tbl>
+      <w:tblPr>
+        <w:tblStyle w:val="Table20"/>
+        <w:tblW w:w="9330.0" w:type="dxa"/>
+        <w:jc w:val="left"/>
+        <w:tblBorders>
+          <w:top w:color="000000" w:space="0" w:sz="4" w:val="single"/>
+          <w:left w:color="000000" w:space="0" w:sz="4" w:val="single"/>
+          <w:bottom w:color="000000" w:space="0" w:sz="4" w:val="single"/>
+          <w:right w:color="000000" w:space="0" w:sz="4" w:val="single"/>
+          <w:insideH w:color="000000" w:space="0" w:sz="4" w:val="single"/>
+          <w:insideV w:color="000000" w:space="0" w:sz="4" w:val="single"/>
+        </w:tblBorders>
+        <w:tblLayout w:type="fixed"/>
+        <w:tblLook w:val="0400"/>
+      </w:tblPr>
+      <w:tblGrid>
+        <w:gridCol w:w="3030"/>
+        <w:gridCol w:w="6300"/>
+        <w:tblGridChange w:id="0">
+          <w:tblGrid>
+            <w:gridCol w:w="3030"/>
+            <w:gridCol w:w="6300"/>
+          </w:tblGrid>
+        </w:tblGridChange>
+      </w:tblGrid>
+      <w:tr>
+        <w:trPr>
+          <w:cantSplit w:val="0"/>
+          <w:tblHeader w:val="0"/>
+        </w:trPr>
+        <w:tc>
+          <w:tcPr/>
+          <w:p>
+            <w:pPr>
+              <w:rPr>
+                <w:rFonts w:ascii="Arial" w:cs="Arial" w:eastAsia="Arial" w:hAnsi="Arial"/>
+                <w:b w:val="1"/>
+                <w:bCs w:val="1"/>
+                <w:sz w:val="20"/>
+                <w:szCs w:val="20"/>
+              </w:rPr>
+            </w:pPr>
+            <w:r>
+              <w:rPr>
+                <w:rFonts w:ascii="Arial" w:cs="Arial" w:eastAsia="Arial" w:hAnsi="Arial"/>
+                <w:b w:val="1"/>
+                <w:bCs w:val="1"/>
+                <w:sz w:val="20"/>
+                <w:szCs w:val="20"/>
+                <w:rtl w:val="0"/>
+              </w:rPr>
+              <w:t xml:space="preserve">Fontes:</w:t>
+            </w:r>
+          </w:p>
+        </w:tc>
+        <w:tc>
+          <w:tcPr/>
+          <w:p>
+            <w:pPr>
+              <w:rPr>
+                <w:rFonts w:ascii="Arial" w:cs="Arial" w:eastAsia="Arial" w:hAnsi="Arial"/>
+                <w:b w:val="1"/>
+                <w:bCs w:val="1"/>
+                <w:sz w:val="20"/>
+                <w:szCs w:val="20"/>
+              </w:rPr>
+            </w:pPr>
+            <w:r>
+              <w:rPr>
+                <w:rFonts w:ascii="Arial" w:cs="Arial" w:eastAsia="Arial" w:hAnsi="Arial"/>
+                <w:b w:val="1"/>
+                <w:bCs w:val="1"/>
+                <w:sz w:val="20"/>
+                <w:szCs w:val="20"/>
+                <w:rtl w:val="0"/>
+              </w:rPr>
+              <w:t xml:space="preserve">Links:</w:t>
+            </w:r>
+          </w:p>
+          <w:p>
+            <w:pPr>
+              <w:rPr>
+                <w:rFonts w:ascii="Arial" w:cs="Arial" w:eastAsia="Arial" w:hAnsi="Arial"/>
+                <w:b w:val="1"/>
+                <w:bCs w:val="1"/>
+                <w:color w:val="1155cc"/>
+                <w:sz w:val="20"/>
+                <w:szCs w:val="20"/>
+                <w:u w:val="single"/>
+              </w:rPr>
+            </w:pPr>
+            <w:hyperlink r:id="rId7">
+              <w:r>
+                <w:rPr>
+                  <w:rFonts w:ascii="Arial" w:cs="Arial" w:eastAsia="Arial" w:hAnsi="Arial"/>
+                  <w:b w:val="1"/>
+                  <w:bCs w:val="1"/>
+                  <w:color w:val="1155cc"/>
+                  <w:sz w:val="20"/>
+                  <w:szCs w:val="20"/>
+                  <w:u w:val="single"/>
+                  <w:rtl w:val="0"/>
+                </w:rPr>
+                <w:t xml:space="preserve">Node.js</w:t>
+              </w:r>
+            </w:hyperlink>
+            <w:r>
+              <w:rPr>
+                <w:rtl w:val="0"/>
+              </w:rPr>
+            </w:r>
+          </w:p>
+          <w:p>
+            <w:pPr>
+              <w:rPr>
+                <w:rFonts w:ascii="Arial" w:cs="Arial" w:eastAsia="Arial" w:hAnsi="Arial"/>
+                <w:b w:val="1"/>
+                <w:bCs w:val="1"/>
+                <w:color w:val="1155cc"/>
+                <w:sz w:val="20"/>
+                <w:szCs w:val="20"/>
+                <w:u w:val="single"/>
+              </w:rPr>
+            </w:pPr>
+            <w:hyperlink r:id="rId8">
+              <w:r>
+                <w:rPr>
+                  <w:rFonts w:ascii="Arial" w:cs="Arial" w:eastAsia="Arial" w:hAnsi="Arial"/>
+                  <w:b w:val="1"/>
+                  <w:bCs w:val="1"/>
+                  <w:color w:val="1155cc"/>
+                  <w:sz w:val="20"/>
+                  <w:szCs w:val="20"/>
+                  <w:u w:val="single"/>
+                  <w:rtl w:val="0"/>
+                </w:rPr>
+                <w:t xml:space="preserve">React</w:t>
+              </w:r>
+            </w:hyperlink>
+            <w:r>
+              <w:rPr>
+                <w:rtl w:val="0"/>
+              </w:rPr>
+            </w:r>
+          </w:p>
+          <w:p>
+            <w:pPr>
+              <w:rPr>
+                <w:rFonts w:ascii="Arial" w:cs="Arial" w:eastAsia="Arial" w:hAnsi="Arial"/>
+                <w:b w:val="1"/>
+                <w:bCs w:val="1"/>
+                <w:color w:val="1155cc"/>
+                <w:sz w:val="20"/>
+                <w:szCs w:val="20"/>
+                <w:u w:val="single"/>
+              </w:rPr>
+            </w:pPr>
+            <w:hyperlink r:id="rId9">
+              <w:r>
+                <w:rPr>
+                  <w:rFonts w:ascii="Arial" w:cs="Arial" w:eastAsia="Arial" w:hAnsi="Arial"/>
+                  <w:b w:val="1"/>
+                  <w:bCs w:val="1"/>
+                  <w:color w:val="1155cc"/>
+                  <w:sz w:val="20"/>
+                  <w:szCs w:val="20"/>
+                  <w:u w:val="single"/>
+                  <w:rtl w:val="0"/>
+                </w:rPr>
+                <w:t xml:space="preserve">Android Studio</w:t>
+              </w:r>
+            </w:hyperlink>
+            <w:r>
+              <w:rPr>
+                <w:rtl w:val="0"/>
+              </w:rPr>
+            </w:r>
+          </w:p>
+          <w:p>
+            <w:pPr>
+              <w:rPr>
+                <w:rFonts w:ascii="Arial" w:cs="Arial" w:eastAsia="Arial" w:hAnsi="Arial"/>
+                <w:b w:val="1"/>
+                <w:bCs w:val="1"/>
+                <w:color w:val="1155cc"/>
+                <w:sz w:val="20"/>
+                <w:szCs w:val="20"/>
+                <w:u w:val="single"/>
+              </w:rPr>
+            </w:pPr>
+            <w:hyperlink r:id="rId10">
+              <w:r>
+                <w:rPr>
+                  <w:rFonts w:ascii="Arial" w:cs="Arial" w:eastAsia="Arial" w:hAnsi="Arial"/>
+                  <w:b w:val="1"/>
+                  <w:bCs w:val="1"/>
+                  <w:color w:val="1155cc"/>
+                  <w:sz w:val="20"/>
+                  <w:szCs w:val="20"/>
+                  <w:u w:val="single"/>
+                  <w:rtl w:val="0"/>
+                </w:rPr>
+                <w:t xml:space="preserve">SQLite Cloud</w:t>
+              </w:r>
+            </w:hyperlink>
+            <w:r>
+              <w:rPr>
+                <w:rtl w:val="0"/>
+              </w:rPr>
+            </w:r>
+          </w:p>
+          <w:p>
+            <w:pPr>
+              <w:rPr>
+                <w:rFonts w:ascii="Arial" w:cs="Arial" w:eastAsia="Arial" w:hAnsi="Arial"/>
+                <w:b w:val="1"/>
+                <w:bCs w:val="1"/>
+                <w:color w:val="1155cc"/>
+                <w:sz w:val="20"/>
+                <w:szCs w:val="20"/>
+                <w:u w:val="single"/>
+              </w:rPr>
+            </w:pPr>
+            <w:hyperlink r:id="rId11">
+              <w:r>
+                <w:rPr>
+                  <w:rFonts w:ascii="Arial" w:cs="Arial" w:eastAsia="Arial" w:hAnsi="Arial"/>
+                  <w:b w:val="1"/>
+                  <w:bCs w:val="1"/>
+                  <w:color w:val="1155cc"/>
+                  <w:sz w:val="20"/>
+                  <w:szCs w:val="20"/>
+                  <w:u w:val="single"/>
+                  <w:rtl w:val="0"/>
+                </w:rPr>
+                <w:t xml:space="preserve">Render (deploy)</w:t>
+              </w:r>
+            </w:hyperlink>
+            <w:r>
+              <w:rPr>
+                <w:rtl w:val="0"/>
+              </w:rPr>
+            </w:r>
+          </w:p>
+          <w:p>
+            <w:pPr>
+              <w:rPr>
+                <w:rFonts w:ascii="Arial" w:cs="Arial" w:eastAsia="Arial" w:hAnsi="Arial"/>
+                <w:b w:val="1"/>
+                <w:bCs w:val="1"/>
+                <w:sz w:val="20"/>
+                <w:szCs w:val="20"/>
+              </w:rPr>
+            </w:pPr>
+            <w:hyperlink r:id="rId12">
+              <w:r>
+                <w:rPr>
+                  <w:rFonts w:ascii="Arial" w:cs="Arial" w:eastAsia="Arial" w:hAnsi="Arial"/>
+                  <w:b w:val="1"/>
+                  <w:bCs w:val="1"/>
+                  <w:color w:val="1155cc"/>
+                  <w:sz w:val="20"/>
+                  <w:szCs w:val="20"/>
+                  <w:u w:val="single"/>
+                  <w:rtl w:val="0"/>
+                </w:rPr>
+                <w:t xml:space="preserve">Figma</w:t>
+              </w:r>
+            </w:hyperlink>
+            <w:r>
+              <w:rPr>
+                <w:rtl w:val="0"/>
+              </w:rPr>
+            </w:r>
+          </w:p>
+        </w:tc>
+      </w:tr>
+    </w:tbl>
+    <w:p>
+      <w:pPr>
+        <w:spacing w:after="0" w:line="240" w:lineRule="auto"/>
+        <w:rPr>
+          <w:rFonts w:ascii="Arial" w:cs="Arial" w:eastAsia="Arial" w:hAnsi="Arial"/>
+          <w:sz w:val="20"/>
+          <w:szCs w:val="20"/>
+        </w:rPr>
+      </w:pPr>
+      <w:r>
+        <w:rPr>
+          <w:rtl w:val="0"/>
+        </w:rPr>
+      </w:r>
+    </w:p>
+    <w:tbl>
+      <w:tblPr>
+        <w:tblStyle w:val="Table21"/>
+        <w:tblW w:w="9345.0" w:type="dxa"/>
+        <w:jc w:val="left"/>
+        <w:tblBorders>
+          <w:top w:color="000000" w:space="0" w:sz="4" w:val="single"/>
+          <w:left w:color="000000" w:space="0" w:sz="4" w:val="single"/>
+          <w:bottom w:color="000000" w:space="0" w:sz="4" w:val="single"/>
+          <w:right w:color="000000" w:space="0" w:sz="4" w:val="single"/>
+          <w:insideH w:color="000000" w:space="0" w:sz="4" w:val="single"/>
+          <w:insideV w:color="000000" w:space="0" w:sz="4" w:val="single"/>
+        </w:tblBorders>
+        <w:tblLayout w:type="fixed"/>
+        <w:tblLook w:val="0400"/>
+      </w:tblPr>
+      <w:tblGrid>
+        <w:gridCol w:w="3046"/>
+        <w:gridCol w:w="6299"/>
+        <w:tblGridChange w:id="0">
+          <w:tblGrid>
+            <w:gridCol w:w="3046"/>
+            <w:gridCol w:w="6299"/>
+          </w:tblGrid>
+        </w:tblGridChange>
+      </w:tblGrid>
+      <w:tr>
+        <w:trPr>
+          <w:cantSplit w:val="0"/>
+          <w:tblHeader w:val="0"/>
+        </w:trPr>
+        <w:tc>
+          <w:tcPr/>
+          <w:p>
+            <w:pPr>
+              <w:rPr>
+                <w:rFonts w:ascii="Arial" w:cs="Arial" w:eastAsia="Arial" w:hAnsi="Arial"/>
+                <w:b w:val="1"/>
+                <w:bCs w:val="1"/>
+                <w:sz w:val="20"/>
+                <w:szCs w:val="20"/>
+              </w:rPr>
+            </w:pPr>
+            <w:r>
+              <w:rPr>
+                <w:rFonts w:ascii="Arial" w:cs="Arial" w:eastAsia="Arial" w:hAnsi="Arial"/>
+                <w:b w:val="1"/>
+                <w:bCs w:val="1"/>
+                <w:sz w:val="20"/>
+                <w:szCs w:val="20"/>
+                <w:rtl w:val="0"/>
+              </w:rPr>
+              <w:t xml:space="preserve">Documentos FECAP</w:t>
+            </w:r>
+          </w:p>
+        </w:tc>
+        <w:tc>
+          <w:tcPr/>
+          <w:p>
+            <w:pPr>
+              <w:rPr>
+                <w:rFonts w:ascii="Arial" w:cs="Arial" w:eastAsia="Arial" w:hAnsi="Arial"/>
+                <w:sz w:val="20"/>
+                <w:szCs w:val="20"/>
+              </w:rPr>
+            </w:pPr>
+            <w:r>
+              <w:rPr>
+                <w:rtl w:val="0"/>
+              </w:rPr>
+            </w:r>
+          </w:p>
+        </w:tc>
+      </w:tr>
+      <w:tr>
+        <w:trPr>
+          <w:cantSplit w:val="0"/>
+          <w:tblHeader w:val="0"/>
+        </w:trPr>
+        <w:tc>
+          <w:tcPr/>
+          <w:p>
+            <w:pPr>
+              <w:rPr>
+                <w:rFonts w:ascii="Arial" w:cs="Arial" w:eastAsia="Arial" w:hAnsi="Arial"/>
+                <w:sz w:val="20"/>
+                <w:szCs w:val="20"/>
+              </w:rPr>
+            </w:pPr>
+            <w:r>
+              <w:rPr>
+                <w:rFonts w:ascii="Arial" w:cs="Arial" w:eastAsia="Arial" w:hAnsi="Arial"/>
+                <w:sz w:val="20"/>
+                <w:szCs w:val="20"/>
+                <w:rtl w:val="0"/>
+              </w:rPr>
+              <w:t xml:space="preserve">Regulamento das Atividade de Extensão</w:t>
+            </w:r>
+          </w:p>
+        </w:tc>
+        <w:tc>
+          <w:tcPr/>
+          <w:p>
+            <w:pPr>
+              <w:rPr>
+                <w:rFonts w:ascii="Arial" w:cs="Arial" w:eastAsia="Arial" w:hAnsi="Arial"/>
+                <w:sz w:val="20"/>
+                <w:szCs w:val="20"/>
+              </w:rPr>
+            </w:pPr>
+            <w:r>
+              <w:rPr>
+                <w:rtl w:val="0"/>
+              </w:rPr>
+            </w:r>
+          </w:p>
+        </w:tc>
+      </w:tr>
+    </w:tbl>
+    <w:p>
+      <w:pPr>
+        <w:spacing w:after="0" w:line="240" w:lineRule="auto"/>
+        <w:rPr>
+          <w:rFonts w:ascii="Arial" w:cs="Arial" w:eastAsia="Arial" w:hAnsi="Arial"/>
           <w:sz w:val="20"/>
           <w:szCs w:val="20"/>
         </w:rPr>
@@ -3179,18 +3890,24 @@
           <w:szCs w:val="20"/>
           <w:rtl w:val="0"/>
         </w:rPr>
-        <w:t xml:space="preserve">Versão 2.0 – 10/2024</w:t>
+        <w:t xml:space="preserve">Versão 3.0 – 05/2026</w:t>
+      </w:r>
+    </w:p>
+    <w:p>
+      <w:pPr>
+        <w:rPr/>
+      </w:pPr>
+      <w:r>
+        <w:rPr>
+          <w:rtl w:val="0"/>
+        </w:rPr>
       </w:r>
     </w:p>
     <w:sectPr>
-      <w:headerReference r:id="rId6" w:type="default"/>
-      <w:headerReference r:id="rId7" w:type="first"/>
-      <w:headerReference r:id="rId8" w:type="even"/>
-      <w:footerReference r:id="rId9" w:type="default"/>
-      <w:footerReference r:id="rId10" w:type="first"/>
-      <w:footerReference r:id="rId11" w:type="even"/>
+      <w:headerReference r:id="rId13" w:type="default"/>
+      <w:footerReference r:id="rId14" w:type="default"/>
       <w:pgSz w:h="16838" w:w="11906" w:orient="portrait"/>
-      <w:pgMar w:bottom="1560" w:top="1985" w:left="1701" w:right="991" w:header="708" w:footer="708"/>
+      <w:pgMar w:bottom="1417" w:top="1417" w:left="1701" w:right="1701" w:header="708" w:footer="708"/>
       <w:pgNumType w:start="1"/>
     </w:sectPr>
   </w:body>
@@ -3199,6 +3916,211 @@
 
 <file path=word/footer1.xml><?xml version="1.0" encoding="utf-8"?>
 <w:ftr xmlns:mc="http://schemas.openxmlformats.org/markup-compatibility/2006" xmlns:o="urn:schemas-microsoft-com:office:office" xmlns:r="http://schemas.openxmlformats.org/officeDocument/2006/relationships" xmlns:m="http://schemas.openxmlformats.org/officeDocument/2006/math" xmlns:v="urn:schemas-microsoft-com:vml" xmlns:wp="http://schemas.openxmlformats.org/drawingml/2006/wordprocessingDrawing" xmlns:w10="urn:schemas-microsoft-com:office:word" xmlns:w="http://schemas.openxmlformats.org/wordprocessingml/2006/main" xmlns:wne="http://schemas.microsoft.com/office/word/2006/wordml" xmlns:sl="http://schemas.openxmlformats.org/schemaLibrary/2006/main" xmlns:a="http://schemas.openxmlformats.org/drawingml/2006/main" xmlns:pic="http://schemas.openxmlformats.org/drawingml/2006/picture" xmlns:c="http://schemas.openxmlformats.org/drawingml/2006/chart" xmlns:lc="http://schemas.openxmlformats.org/drawingml/2006/lockedCanvas" xmlns:dgm="http://schemas.openxmlformats.org/drawingml/2006/diagram" xmlns:wps="http://schemas.microsoft.com/office/word/2010/wordprocessingShape" xmlns:wpg="http://schemas.microsoft.com/office/word/2010/wordprocessingGroup" xmlns:w14="http://schemas.microsoft.com/office/word/2010/wordml" xmlns:w15="http://schemas.microsoft.com/office/word/2012/wordml" xmlns:w16="http://schemas.microsoft.com/office/word/2018/wordml" xmlns:w16cex="http://schemas.microsoft.com/office/word/2018/wordml/cex" xmlns:w16cid="http://schemas.microsoft.com/office/word/2016/wordml/cid" xmlns="http://schemas.microsoft.com/office/tasks/2019/documenttasks" xmlns:cr="http://schemas.microsoft.com/office/comments/2020/reactions">
+  <w:p>
+    <w:pPr>
+      <w:keepNext w:val="0"/>
+      <w:keepLines w:val="0"/>
+      <w:pageBreakBefore w:val="0"/>
+      <w:widowControl w:val="0"/>
+      <w:pBdr>
+        <w:top w:space="0" w:sz="0" w:val="nil"/>
+        <w:left w:space="0" w:sz="0" w:val="nil"/>
+        <w:bottom w:space="0" w:sz="0" w:val="nil"/>
+        <w:right w:space="0" w:sz="0" w:val="nil"/>
+        <w:between w:space="0" w:sz="0" w:val="nil"/>
+      </w:pBdr>
+      <w:shd w:fill="auto" w:val="clear"/>
+      <w:spacing w:after="0" w:before="0" w:line="276" w:lineRule="auto"/>
+      <w:ind w:left="0" w:right="0" w:firstLine="0"/>
+      <w:jc w:val="left"/>
+      <w:rPr>
+        <w:rFonts w:ascii="Aptos" w:cs="Aptos" w:eastAsia="Aptos" w:hAnsi="Aptos"/>
+        <w:b w:val="0"/>
+        <w:bCs w:val="0"/>
+        <w:i w:val="0"/>
+        <w:iCs w:val="0"/>
+        <w:smallCaps w:val="0"/>
+        <w:strike w:val="0"/>
+        <w:color w:val="000000"/>
+        <w:sz w:val="22"/>
+        <w:szCs w:val="22"/>
+        <w:u w:val="none"/>
+        <w:shd w:fill="auto" w:val="clear"/>
+        <w:vertAlign w:val="baseline"/>
+      </w:rPr>
+    </w:pPr>
+    <w:r>
+      <w:rPr>
+        <w:rtl w:val="0"/>
+      </w:rPr>
+    </w:r>
+  </w:p>
+  <w:tbl>
+    <w:tblPr>
+      <w:tblStyle w:val="Table22"/>
+      <w:tblW w:w="8490.0" w:type="dxa"/>
+      <w:jc w:val="left"/>
+      <w:tblLayout w:type="fixed"/>
+      <w:tblLook w:val="0600"/>
+    </w:tblPr>
+    <w:tblGrid>
+      <w:gridCol w:w="2830"/>
+      <w:gridCol w:w="2830"/>
+      <w:gridCol w:w="2830"/>
+      <w:tblGridChange w:id="0">
+        <w:tblGrid>
+          <w:gridCol w:w="2830"/>
+          <w:gridCol w:w="2830"/>
+          <w:gridCol w:w="2830"/>
+        </w:tblGrid>
+      </w:tblGridChange>
+    </w:tblGrid>
+    <w:tr>
+      <w:trPr>
+        <w:cantSplit w:val="0"/>
+        <w:trHeight w:val="300" w:hRule="atLeast"/>
+        <w:tblHeader w:val="0"/>
+      </w:trPr>
+      <w:tc>
+        <w:tcPr/>
+        <w:p>
+          <w:pPr>
+            <w:keepNext w:val="0"/>
+            <w:keepLines w:val="0"/>
+            <w:pageBreakBefore w:val="0"/>
+            <w:widowControl w:val="1"/>
+            <w:pBdr>
+              <w:top w:space="0" w:sz="0" w:val="nil"/>
+              <w:left w:space="0" w:sz="0" w:val="nil"/>
+              <w:bottom w:space="0" w:sz="0" w:val="nil"/>
+              <w:right w:space="0" w:sz="0" w:val="nil"/>
+              <w:between w:space="0" w:sz="0" w:val="nil"/>
+            </w:pBdr>
+            <w:shd w:fill="auto" w:val="clear"/>
+            <w:tabs>
+              <w:tab w:val="center" w:leader="none" w:pos="4252"/>
+              <w:tab w:val="right" w:leader="none" w:pos="8504"/>
+            </w:tabs>
+            <w:spacing w:after="0" w:before="0" w:line="240" w:lineRule="auto"/>
+            <w:ind w:left="-115" w:right="0" w:firstLine="0"/>
+            <w:jc w:val="left"/>
+            <w:rPr>
+              <w:rFonts w:ascii="Aptos" w:cs="Aptos" w:eastAsia="Aptos" w:hAnsi="Aptos"/>
+              <w:b w:val="0"/>
+              <w:bCs w:val="0"/>
+              <w:i w:val="0"/>
+              <w:iCs w:val="0"/>
+              <w:smallCaps w:val="0"/>
+              <w:strike w:val="0"/>
+              <w:color w:val="000000"/>
+              <w:sz w:val="22"/>
+              <w:szCs w:val="22"/>
+              <w:u w:val="none"/>
+              <w:shd w:fill="auto" w:val="clear"/>
+              <w:vertAlign w:val="baseline"/>
+            </w:rPr>
+          </w:pPr>
+          <w:r>
+            <w:rPr>
+              <w:rtl w:val="0"/>
+            </w:rPr>
+          </w:r>
+        </w:p>
+      </w:tc>
+      <w:tc>
+        <w:tcPr/>
+        <w:p>
+          <w:pPr>
+            <w:keepNext w:val="0"/>
+            <w:keepLines w:val="0"/>
+            <w:pageBreakBefore w:val="0"/>
+            <w:widowControl w:val="1"/>
+            <w:pBdr>
+              <w:top w:space="0" w:sz="0" w:val="nil"/>
+              <w:left w:space="0" w:sz="0" w:val="nil"/>
+              <w:bottom w:space="0" w:sz="0" w:val="nil"/>
+              <w:right w:space="0" w:sz="0" w:val="nil"/>
+              <w:between w:space="0" w:sz="0" w:val="nil"/>
+            </w:pBdr>
+            <w:shd w:fill="auto" w:val="clear"/>
+            <w:tabs>
+              <w:tab w:val="center" w:leader="none" w:pos="4252"/>
+              <w:tab w:val="right" w:leader="none" w:pos="8504"/>
+            </w:tabs>
+            <w:spacing w:after="0" w:before="0" w:line="240" w:lineRule="auto"/>
+            <w:ind w:left="0" w:right="0" w:firstLine="0"/>
+            <w:jc w:val="center"/>
+            <w:rPr>
+              <w:rFonts w:ascii="Aptos" w:cs="Aptos" w:eastAsia="Aptos" w:hAnsi="Aptos"/>
+              <w:b w:val="0"/>
+              <w:bCs w:val="0"/>
+              <w:i w:val="0"/>
+              <w:iCs w:val="0"/>
+              <w:smallCaps w:val="0"/>
+              <w:strike w:val="0"/>
+              <w:color w:val="000000"/>
+              <w:sz w:val="22"/>
+              <w:szCs w:val="22"/>
+              <w:u w:val="none"/>
+              <w:shd w:fill="auto" w:val="clear"/>
+              <w:vertAlign w:val="baseline"/>
+            </w:rPr>
+          </w:pPr>
+          <w:r>
+            <w:rPr>
+              <w:rtl w:val="0"/>
+            </w:rPr>
+          </w:r>
+        </w:p>
+      </w:tc>
+      <w:tc>
+        <w:tcPr/>
+        <w:p>
+          <w:pPr>
+            <w:keepNext w:val="0"/>
+            <w:keepLines w:val="0"/>
+            <w:pageBreakBefore w:val="0"/>
+            <w:widowControl w:val="1"/>
+            <w:pBdr>
+              <w:top w:space="0" w:sz="0" w:val="nil"/>
+              <w:left w:space="0" w:sz="0" w:val="nil"/>
+              <w:bottom w:space="0" w:sz="0" w:val="nil"/>
+              <w:right w:space="0" w:sz="0" w:val="nil"/>
+              <w:between w:space="0" w:sz="0" w:val="nil"/>
+            </w:pBdr>
+            <w:shd w:fill="auto" w:val="clear"/>
+            <w:tabs>
+              <w:tab w:val="center" w:leader="none" w:pos="4252"/>
+              <w:tab w:val="right" w:leader="none" w:pos="8504"/>
+            </w:tabs>
+            <w:spacing w:after="0" w:before="0" w:line="240" w:lineRule="auto"/>
+            <w:ind w:left="0" w:right="-115" w:firstLine="0"/>
+            <w:jc w:val="right"/>
+            <w:rPr>
+              <w:rFonts w:ascii="Aptos" w:cs="Aptos" w:eastAsia="Aptos" w:hAnsi="Aptos"/>
+              <w:b w:val="0"/>
+              <w:bCs w:val="0"/>
+              <w:i w:val="0"/>
+              <w:iCs w:val="0"/>
+              <w:smallCaps w:val="0"/>
+              <w:strike w:val="0"/>
+              <w:color w:val="000000"/>
+              <w:sz w:val="22"/>
+              <w:szCs w:val="22"/>
+              <w:u w:val="none"/>
+              <w:shd w:fill="auto" w:val="clear"/>
+              <w:vertAlign w:val="baseline"/>
+            </w:rPr>
+          </w:pPr>
+          <w:r>
+            <w:rPr>
+              <w:rtl w:val="0"/>
+            </w:rPr>
+          </w:r>
+        </w:p>
+      </w:tc>
+    </w:tr>
+  </w:tbl>
   <w:p>
     <w:pPr>
       <w:keepNext w:val="0"/>
@@ -3221,103 +4143,7 @@
       <w:ind w:left="0" w:right="0" w:firstLine="0"/>
       <w:jc w:val="left"/>
       <w:rPr>
-        <w:rFonts w:ascii="Calibri" w:cs="Calibri" w:eastAsia="Calibri" w:hAnsi="Calibri"/>
-        <w:b w:val="0"/>
-        <w:bCs w:val="0"/>
-        <w:i w:val="0"/>
-        <w:iCs w:val="0"/>
-        <w:smallCaps w:val="0"/>
-        <w:strike w:val="0"/>
-        <w:color w:val="000000"/>
-        <w:sz w:val="22"/>
-        <w:szCs w:val="22"/>
-        <w:u w:val="none"/>
-        <w:shd w:fill="auto" w:val="clear"/>
-        <w:vertAlign w:val="baseline"/>
-      </w:rPr>
-    </w:pPr>
-    <w:r>
-      <w:rPr>
-        <w:rtl w:val="0"/>
-      </w:rPr>
-    </w:r>
-  </w:p>
-</w:ftr>
-</file>
-
-<file path=word/footer2.xml><?xml version="1.0" encoding="utf-8"?>
-<w:ftr xmlns:mc="http://schemas.openxmlformats.org/markup-compatibility/2006" xmlns:o="urn:schemas-microsoft-com:office:office" xmlns:r="http://schemas.openxmlformats.org/officeDocument/2006/relationships" xmlns:m="http://schemas.openxmlformats.org/officeDocument/2006/math" xmlns:v="urn:schemas-microsoft-com:vml" xmlns:wp="http://schemas.openxmlformats.org/drawingml/2006/wordprocessingDrawing" xmlns:w10="urn:schemas-microsoft-com:office:word" xmlns:w="http://schemas.openxmlformats.org/wordprocessingml/2006/main" xmlns:wne="http://schemas.microsoft.com/office/word/2006/wordml" xmlns:sl="http://schemas.openxmlformats.org/schemaLibrary/2006/main" xmlns:a="http://schemas.openxmlformats.org/drawingml/2006/main" xmlns:pic="http://schemas.openxmlformats.org/drawingml/2006/picture" xmlns:c="http://schemas.openxmlformats.org/drawingml/2006/chart" xmlns:lc="http://schemas.openxmlformats.org/drawingml/2006/lockedCanvas" xmlns:dgm="http://schemas.openxmlformats.org/drawingml/2006/diagram" xmlns:wps="http://schemas.microsoft.com/office/word/2010/wordprocessingShape" xmlns:wpg="http://schemas.microsoft.com/office/word/2010/wordprocessingGroup" xmlns:w14="http://schemas.microsoft.com/office/word/2010/wordml" xmlns:w15="http://schemas.microsoft.com/office/word/2012/wordml" xmlns:w16="http://schemas.microsoft.com/office/word/2018/wordml" xmlns:w16cex="http://schemas.microsoft.com/office/word/2018/wordml/cex" xmlns:w16cid="http://schemas.microsoft.com/office/word/2016/wordml/cid" xmlns="http://schemas.microsoft.com/office/tasks/2019/documenttasks" xmlns:cr="http://schemas.microsoft.com/office/comments/2020/reactions">
-  <w:p>
-    <w:pPr>
-      <w:keepNext w:val="0"/>
-      <w:keepLines w:val="0"/>
-      <w:pageBreakBefore w:val="0"/>
-      <w:widowControl w:val="1"/>
-      <w:pBdr>
-        <w:top w:space="0" w:sz="0" w:val="nil"/>
-        <w:left w:space="0" w:sz="0" w:val="nil"/>
-        <w:bottom w:space="0" w:sz="0" w:val="nil"/>
-        <w:right w:space="0" w:sz="0" w:val="nil"/>
-        <w:between w:space="0" w:sz="0" w:val="nil"/>
-      </w:pBdr>
-      <w:shd w:fill="auto" w:val="clear"/>
-      <w:tabs>
-        <w:tab w:val="center" w:leader="none" w:pos="4252"/>
-        <w:tab w:val="right" w:leader="none" w:pos="8504"/>
-      </w:tabs>
-      <w:spacing w:after="0" w:before="0" w:line="240" w:lineRule="auto"/>
-      <w:ind w:left="0" w:right="0" w:firstLine="0"/>
-      <w:jc w:val="left"/>
-      <w:rPr>
-        <w:rFonts w:ascii="Calibri" w:cs="Calibri" w:eastAsia="Calibri" w:hAnsi="Calibri"/>
-        <w:b w:val="0"/>
-        <w:bCs w:val="0"/>
-        <w:i w:val="0"/>
-        <w:iCs w:val="0"/>
-        <w:smallCaps w:val="0"/>
-        <w:strike w:val="0"/>
-        <w:color w:val="000000"/>
-        <w:sz w:val="22"/>
-        <w:szCs w:val="22"/>
-        <w:u w:val="none"/>
-        <w:shd w:fill="auto" w:val="clear"/>
-        <w:vertAlign w:val="baseline"/>
-      </w:rPr>
-    </w:pPr>
-    <w:r>
-      <w:rPr>
-        <w:rtl w:val="0"/>
-      </w:rPr>
-    </w:r>
-  </w:p>
-</w:ftr>
-</file>
-
-<file path=word/footer3.xml><?xml version="1.0" encoding="utf-8"?>
-<w:ftr xmlns:mc="http://schemas.openxmlformats.org/markup-compatibility/2006" xmlns:o="urn:schemas-microsoft-com:office:office" xmlns:r="http://schemas.openxmlformats.org/officeDocument/2006/relationships" xmlns:m="http://schemas.openxmlformats.org/officeDocument/2006/math" xmlns:v="urn:schemas-microsoft-com:vml" xmlns:wp="http://schemas.openxmlformats.org/drawingml/2006/wordprocessingDrawing" xmlns:w10="urn:schemas-microsoft-com:office:word" xmlns:w="http://schemas.openxmlformats.org/wordprocessingml/2006/main" xmlns:wne="http://schemas.microsoft.com/office/word/2006/wordml" xmlns:sl="http://schemas.openxmlformats.org/schemaLibrary/2006/main" xmlns:a="http://schemas.openxmlformats.org/drawingml/2006/main" xmlns:pic="http://schemas.openxmlformats.org/drawingml/2006/picture" xmlns:c="http://schemas.openxmlformats.org/drawingml/2006/chart" xmlns:lc="http://schemas.openxmlformats.org/drawingml/2006/lockedCanvas" xmlns:dgm="http://schemas.openxmlformats.org/drawingml/2006/diagram" xmlns:wps="http://schemas.microsoft.com/office/word/2010/wordprocessingShape" xmlns:wpg="http://schemas.microsoft.com/office/word/2010/wordprocessingGroup" xmlns:w14="http://schemas.microsoft.com/office/word/2010/wordml" xmlns:w15="http://schemas.microsoft.com/office/word/2012/wordml" xmlns:w16="http://schemas.microsoft.com/office/word/2018/wordml" xmlns:w16cex="http://schemas.microsoft.com/office/word/2018/wordml/cex" xmlns:w16cid="http://schemas.microsoft.com/office/word/2016/wordml/cid" xmlns="http://schemas.microsoft.com/office/tasks/2019/documenttasks" xmlns:cr="http://schemas.microsoft.com/office/comments/2020/reactions">
-  <w:p>
-    <w:pPr>
-      <w:keepNext w:val="0"/>
-      <w:keepLines w:val="0"/>
-      <w:pageBreakBefore w:val="0"/>
-      <w:widowControl w:val="1"/>
-      <w:pBdr>
-        <w:top w:space="0" w:sz="0" w:val="nil"/>
-        <w:left w:space="0" w:sz="0" w:val="nil"/>
-        <w:bottom w:space="0" w:sz="0" w:val="nil"/>
-        <w:right w:space="0" w:sz="0" w:val="nil"/>
-        <w:between w:space="0" w:sz="0" w:val="nil"/>
-      </w:pBdr>
-      <w:shd w:fill="auto" w:val="clear"/>
-      <w:tabs>
-        <w:tab w:val="center" w:leader="none" w:pos="4252"/>
-        <w:tab w:val="right" w:leader="none" w:pos="8504"/>
-      </w:tabs>
-      <w:spacing w:after="0" w:before="0" w:line="240" w:lineRule="auto"/>
-      <w:ind w:left="0" w:right="0" w:firstLine="0"/>
-      <w:jc w:val="left"/>
-      <w:rPr>
-        <w:rFonts w:ascii="Calibri" w:cs="Calibri" w:eastAsia="Calibri" w:hAnsi="Calibri"/>
+        <w:rFonts w:ascii="Aptos" w:cs="Aptos" w:eastAsia="Aptos" w:hAnsi="Aptos"/>
         <w:b w:val="0"/>
         <w:bCs w:val="0"/>
         <w:i w:val="0"/>
@@ -3365,55 +4191,7 @@
       <w:ind w:left="0" w:right="0" w:firstLine="0"/>
       <w:jc w:val="left"/>
       <w:rPr>
-        <w:rFonts w:ascii="Calibri" w:cs="Calibri" w:eastAsia="Calibri" w:hAnsi="Calibri"/>
-        <w:b w:val="0"/>
-        <w:bCs w:val="0"/>
-        <w:i w:val="0"/>
-        <w:iCs w:val="0"/>
-        <w:smallCaps w:val="0"/>
-        <w:strike w:val="0"/>
-        <w:color w:val="000000"/>
-        <w:sz w:val="22"/>
-        <w:szCs w:val="22"/>
-        <w:u w:val="none"/>
-        <w:shd w:fill="auto" w:val="clear"/>
-        <w:vertAlign w:val="baseline"/>
-      </w:rPr>
-    </w:pPr>
-    <w:r>
-      <w:rPr>
-        <w:rtl w:val="0"/>
-      </w:rPr>
-    </w:r>
-  </w:p>
-</w:hdr>
-</file>
-
-<file path=word/header2.xml><?xml version="1.0" encoding="utf-8"?>
-<w:hdr xmlns:mc="http://schemas.openxmlformats.org/markup-compatibility/2006" xmlns:o="urn:schemas-microsoft-com:office:office" xmlns:r="http://schemas.openxmlformats.org/officeDocument/2006/relationships" xmlns:m="http://schemas.openxmlformats.org/officeDocument/2006/math" xmlns:v="urn:schemas-microsoft-com:vml" xmlns:wp="http://schemas.openxmlformats.org/drawingml/2006/wordprocessingDrawing" xmlns:w10="urn:schemas-microsoft-com:office:word" xmlns:w="http://schemas.openxmlformats.org/wordprocessingml/2006/main" xmlns:wne="http://schemas.microsoft.com/office/word/2006/wordml" xmlns:sl="http://schemas.openxmlformats.org/schemaLibrary/2006/main" xmlns:a="http://schemas.openxmlformats.org/drawingml/2006/main" xmlns:pic="http://schemas.openxmlformats.org/drawingml/2006/picture" xmlns:c="http://schemas.openxmlformats.org/drawingml/2006/chart" xmlns:lc="http://schemas.openxmlformats.org/drawingml/2006/lockedCanvas" xmlns:dgm="http://schemas.openxmlformats.org/drawingml/2006/diagram" xmlns:wps="http://schemas.microsoft.com/office/word/2010/wordprocessingShape" xmlns:wpg="http://schemas.microsoft.com/office/word/2010/wordprocessingGroup" xmlns:w14="http://schemas.microsoft.com/office/word/2010/wordml" xmlns:w15="http://schemas.microsoft.com/office/word/2012/wordml" xmlns:w16="http://schemas.microsoft.com/office/word/2018/wordml" xmlns:w16cex="http://schemas.microsoft.com/office/word/2018/wordml/cex" xmlns:w16cid="http://schemas.microsoft.com/office/word/2016/wordml/cid" xmlns="http://schemas.microsoft.com/office/tasks/2019/documenttasks" xmlns:cr="http://schemas.microsoft.com/office/comments/2020/reactions">
-  <w:p>
-    <w:pPr>
-      <w:keepNext w:val="0"/>
-      <w:keepLines w:val="0"/>
-      <w:pageBreakBefore w:val="0"/>
-      <w:widowControl w:val="1"/>
-      <w:pBdr>
-        <w:top w:space="0" w:sz="0" w:val="nil"/>
-        <w:left w:space="0" w:sz="0" w:val="nil"/>
-        <w:bottom w:space="0" w:sz="0" w:val="nil"/>
-        <w:right w:space="0" w:sz="0" w:val="nil"/>
-        <w:between w:space="0" w:sz="0" w:val="nil"/>
-      </w:pBdr>
-      <w:shd w:fill="auto" w:val="clear"/>
-      <w:tabs>
-        <w:tab w:val="center" w:leader="none" w:pos="4252"/>
-        <w:tab w:val="right" w:leader="none" w:pos="8504"/>
-      </w:tabs>
-      <w:spacing w:after="0" w:before="0" w:line="240" w:lineRule="auto"/>
-      <w:ind w:left="0" w:right="0" w:firstLine="0"/>
-      <w:jc w:val="left"/>
-      <w:rPr>
-        <w:rFonts w:ascii="Calibri" w:cs="Calibri" w:eastAsia="Calibri" w:hAnsi="Calibri"/>
+        <w:rFonts w:ascii="Aptos" w:cs="Aptos" w:eastAsia="Aptos" w:hAnsi="Aptos"/>
         <w:b w:val="0"/>
         <w:bCs w:val="0"/>
         <w:i w:val="0"/>
@@ -3438,12 +4216,12 @@
         <wp:anchor allowOverlap="1" behindDoc="1" distB="0" distT="0" distL="0" distR="0" hidden="0" layoutInCell="1" locked="0" relativeHeight="0" simplePos="0">
           <wp:simplePos x="0" y="0"/>
           <wp:positionH relativeFrom="column">
-            <wp:posOffset>-1069339</wp:posOffset>
+            <wp:posOffset>-1085849</wp:posOffset>
           </wp:positionH>
           <wp:positionV relativeFrom="paragraph">
-            <wp:posOffset>-449579</wp:posOffset>
+            <wp:posOffset>-457199</wp:posOffset>
           </wp:positionV>
-          <wp:extent cx="7568945" cy="10706400"/>
+          <wp:extent cx="7577941" cy="10714945"/>
           <wp:effectExtent b="0" l="0" r="0" t="0"/>
           <wp:wrapNone/>
           <wp:docPr id="1" name="image1.jpg"/>
@@ -3464,7 +4242,7 @@
                 <pic:spPr>
                   <a:xfrm>
                     <a:off x="0" y="0"/>
-                    <a:ext cx="7568945" cy="10706400"/>
+                    <a:ext cx="7577941" cy="10714945"/>
                   </a:xfrm>
                   <a:prstGeom prst="rect"/>
                   <a:ln/>
@@ -3479,57 +4257,101 @@
 </w:hdr>
 </file>
 
-<file path=word/header3.xml><?xml version="1.0" encoding="utf-8"?>
-<w:hdr xmlns:mc="http://schemas.openxmlformats.org/markup-compatibility/2006" xmlns:o="urn:schemas-microsoft-com:office:office" xmlns:r="http://schemas.openxmlformats.org/officeDocument/2006/relationships" xmlns:m="http://schemas.openxmlformats.org/officeDocument/2006/math" xmlns:v="urn:schemas-microsoft-com:vml" xmlns:wp="http://schemas.openxmlformats.org/drawingml/2006/wordprocessingDrawing" xmlns:w10="urn:schemas-microsoft-com:office:word" xmlns:w="http://schemas.openxmlformats.org/wordprocessingml/2006/main" xmlns:wne="http://schemas.microsoft.com/office/word/2006/wordml" xmlns:sl="http://schemas.openxmlformats.org/schemaLibrary/2006/main" xmlns:a="http://schemas.openxmlformats.org/drawingml/2006/main" xmlns:pic="http://schemas.openxmlformats.org/drawingml/2006/picture" xmlns:c="http://schemas.openxmlformats.org/drawingml/2006/chart" xmlns:lc="http://schemas.openxmlformats.org/drawingml/2006/lockedCanvas" xmlns:dgm="http://schemas.openxmlformats.org/drawingml/2006/diagram" xmlns:wps="http://schemas.microsoft.com/office/word/2010/wordprocessingShape" xmlns:wpg="http://schemas.microsoft.com/office/word/2010/wordprocessingGroup" xmlns:w14="http://schemas.microsoft.com/office/word/2010/wordml" xmlns:w15="http://schemas.microsoft.com/office/word/2012/wordml" xmlns:w16="http://schemas.microsoft.com/office/word/2018/wordml" xmlns:w16cex="http://schemas.microsoft.com/office/word/2018/wordml/cex" xmlns:w16cid="http://schemas.microsoft.com/office/word/2016/wordml/cid" xmlns="http://schemas.microsoft.com/office/tasks/2019/documenttasks" xmlns:cr="http://schemas.microsoft.com/office/comments/2020/reactions">
-  <w:p>
-    <w:pPr>
-      <w:keepNext w:val="0"/>
-      <w:keepLines w:val="0"/>
-      <w:pageBreakBefore w:val="0"/>
-      <w:widowControl w:val="1"/>
-      <w:pBdr>
-        <w:top w:space="0" w:sz="0" w:val="nil"/>
-        <w:left w:space="0" w:sz="0" w:val="nil"/>
-        <w:bottom w:space="0" w:sz="0" w:val="nil"/>
-        <w:right w:space="0" w:sz="0" w:val="nil"/>
-        <w:between w:space="0" w:sz="0" w:val="nil"/>
-      </w:pBdr>
-      <w:shd w:fill="auto" w:val="clear"/>
-      <w:tabs>
-        <w:tab w:val="center" w:leader="none" w:pos="4252"/>
-        <w:tab w:val="right" w:leader="none" w:pos="8504"/>
-      </w:tabs>
-      <w:spacing w:after="0" w:before="0" w:line="240" w:lineRule="auto"/>
-      <w:ind w:left="0" w:right="0" w:firstLine="0"/>
-      <w:jc w:val="left"/>
-      <w:rPr>
-        <w:rFonts w:ascii="Calibri" w:cs="Calibri" w:eastAsia="Calibri" w:hAnsi="Calibri"/>
-        <w:b w:val="0"/>
-        <w:bCs w:val="0"/>
-        <w:i w:val="0"/>
-        <w:iCs w:val="0"/>
-        <w:smallCaps w:val="0"/>
-        <w:strike w:val="0"/>
-        <w:color w:val="000000"/>
-        <w:sz w:val="22"/>
-        <w:szCs w:val="22"/>
-        <w:u w:val="none"/>
-        <w:shd w:fill="auto" w:val="clear"/>
-        <w:vertAlign w:val="baseline"/>
-      </w:rPr>
-    </w:pPr>
-    <w:r>
-      <w:rPr>
-        <w:rtl w:val="0"/>
-      </w:rPr>
-    </w:r>
-  </w:p>
-</w:hdr>
-</file>
-
 <file path=word/numbering.xml><?xml version="1.0" encoding="utf-8"?>
 <w:numbering xmlns:mc="http://schemas.openxmlformats.org/markup-compatibility/2006" xmlns:o="urn:schemas-microsoft-com:office:office" xmlns:r="http://schemas.openxmlformats.org/officeDocument/2006/relationships" xmlns:m="http://schemas.openxmlformats.org/officeDocument/2006/math" xmlns:v="urn:schemas-microsoft-com:vml" xmlns:wp="http://schemas.openxmlformats.org/drawingml/2006/wordprocessingDrawing" xmlns:w10="urn:schemas-microsoft-com:office:word" xmlns:w="http://schemas.openxmlformats.org/wordprocessingml/2006/main" xmlns:wne="http://schemas.microsoft.com/office/word/2006/wordml" xmlns:sl="http://schemas.openxmlformats.org/schemaLibrary/2006/main" xmlns:a="http://schemas.openxmlformats.org/drawingml/2006/main" xmlns:pic="http://schemas.openxmlformats.org/drawingml/2006/picture" xmlns:c="http://schemas.openxmlformats.org/drawingml/2006/chart" xmlns:lc="http://schemas.openxmlformats.org/drawingml/2006/lockedCanvas" xmlns:dgm="http://schemas.openxmlformats.org/drawingml/2006/diagram" xmlns:wps="http://schemas.microsoft.com/office/word/2010/wordprocessingShape" xmlns:wpg="http://schemas.microsoft.com/office/word/2010/wordprocessingGroup" xmlns:w14="http://schemas.microsoft.com/office/word/2010/wordml" xmlns:w15="http://schemas.microsoft.com/office/word/2012/wordml" xmlns:w16="http://schemas.microsoft.com/office/word/2018/wordml" xmlns:w16cex="http://schemas.microsoft.com/office/word/2018/wordml/cex" xmlns:w16cid="http://schemas.microsoft.com/office/word/2016/wordml/cid" xmlns="http://schemas.microsoft.com/office/tasks/2019/documenttasks" xmlns:cr="http://schemas.microsoft.com/office/comments/2020/reactions">
   <w:abstractNum w:abstractNumId="1">
+    <w:lvl w:ilvl="0">
+      <w:start w:val="1"/>
+      <w:numFmt w:val="bullet"/>
+      <w:lvlText w:val="●"/>
+      <w:lvlJc w:val="left"/>
+      <w:pPr>
+        <w:ind w:left="720" w:hanging="360"/>
+      </w:pPr>
+      <w:rPr/>
+    </w:lvl>
+    <w:lvl w:ilvl="1">
+      <w:start w:val="1"/>
+      <w:numFmt w:val="decimal"/>
+      <w:lvlText w:val="%2."/>
+      <w:lvlJc w:val="left"/>
+      <w:pPr>
+        <w:ind w:left="1440" w:hanging="360"/>
+      </w:pPr>
+      <w:rPr/>
+    </w:lvl>
+    <w:lvl w:ilvl="2">
+      <w:start w:val="1"/>
+      <w:numFmt w:val="decimal"/>
+      <w:lvlText w:val="%3."/>
+      <w:lvlJc w:val="left"/>
+      <w:pPr>
+        <w:ind w:left="2160" w:hanging="360"/>
+      </w:pPr>
+      <w:rPr/>
+    </w:lvl>
+    <w:lvl w:ilvl="3">
+      <w:start w:val="1"/>
+      <w:numFmt w:val="decimal"/>
+      <w:lvlText w:val="%4."/>
+      <w:lvlJc w:val="left"/>
+      <w:pPr>
+        <w:ind w:left="2880" w:hanging="360"/>
+      </w:pPr>
+      <w:rPr/>
+    </w:lvl>
+    <w:lvl w:ilvl="4">
+      <w:start w:val="1"/>
+      <w:numFmt w:val="decimal"/>
+      <w:lvlText w:val="%5."/>
+      <w:lvlJc w:val="left"/>
+      <w:pPr>
+        <w:ind w:left="3600" w:hanging="360"/>
+      </w:pPr>
+      <w:rPr/>
+    </w:lvl>
+    <w:lvl w:ilvl="5">
+      <w:start w:val="1"/>
+      <w:numFmt w:val="decimal"/>
+      <w:lvlText w:val="%6."/>
+      <w:lvlJc w:val="left"/>
+      <w:pPr>
+        <w:ind w:left="4320" w:hanging="360"/>
+      </w:pPr>
+      <w:rPr/>
+    </w:lvl>
+    <w:lvl w:ilvl="6">
+      <w:start w:val="1"/>
+      <w:numFmt w:val="decimal"/>
+      <w:lvlText w:val="%7."/>
+      <w:lvlJc w:val="left"/>
+      <w:pPr>
+        <w:ind w:left="5040" w:hanging="360"/>
+      </w:pPr>
+      <w:rPr/>
+    </w:lvl>
+    <w:lvl w:ilvl="7">
+      <w:start w:val="1"/>
+      <w:numFmt w:val="decimal"/>
+      <w:lvlText w:val="%8."/>
+      <w:lvlJc w:val="left"/>
+      <w:pPr>
+        <w:ind w:left="5760" w:hanging="360"/>
+      </w:pPr>
+      <w:rPr/>
+    </w:lvl>
+    <w:lvl w:ilvl="8">
+      <w:start w:val="1"/>
+      <w:numFmt w:val="decimal"/>
+      <w:lvlText w:val="%9."/>
+      <w:lvlJc w:val="left"/>
+      <w:pPr>
+        <w:ind w:left="6480" w:hanging="360"/>
+      </w:pPr>
+      <w:rPr/>
+    </w:lvl>
+  </w:abstractNum>
+  <w:abstractNum w:abstractNumId="2">
     <w:lvl w:ilvl="0">
       <w:start w:val="1"/>
       <w:numFmt w:val="bullet"/>
@@ -3637,98 +4459,6 @@
       <w:rPr>
         <w:u w:val="none"/>
       </w:rPr>
-    </w:lvl>
-  </w:abstractNum>
-  <w:abstractNum w:abstractNumId="2">
-    <w:lvl w:ilvl="0">
-      <w:start w:val="1"/>
-      <w:numFmt w:val="bullet"/>
-      <w:lvlText w:val="●"/>
-      <w:lvlJc w:val="left"/>
-      <w:pPr>
-        <w:ind w:left="720" w:hanging="360"/>
-      </w:pPr>
-      <w:rPr/>
-    </w:lvl>
-    <w:lvl w:ilvl="1">
-      <w:start w:val="1"/>
-      <w:numFmt w:val="decimal"/>
-      <w:lvlText w:val="%2."/>
-      <w:lvlJc w:val="left"/>
-      <w:pPr>
-        <w:ind w:left="1440" w:hanging="360"/>
-      </w:pPr>
-      <w:rPr/>
-    </w:lvl>
-    <w:lvl w:ilvl="2">
-      <w:start w:val="1"/>
-      <w:numFmt w:val="decimal"/>
-      <w:lvlText w:val="%3."/>
-      <w:lvlJc w:val="left"/>
-      <w:pPr>
-        <w:ind w:left="2160" w:hanging="360"/>
-      </w:pPr>
-      <w:rPr/>
-    </w:lvl>
-    <w:lvl w:ilvl="3">
-      <w:start w:val="1"/>
-      <w:numFmt w:val="decimal"/>
-      <w:lvlText w:val="%4."/>
-      <w:lvlJc w:val="left"/>
-      <w:pPr>
-        <w:ind w:left="2880" w:hanging="360"/>
-      </w:pPr>
-      <w:rPr/>
-    </w:lvl>
-    <w:lvl w:ilvl="4">
-      <w:start w:val="1"/>
-      <w:numFmt w:val="decimal"/>
-      <w:lvlText w:val="%5."/>
-      <w:lvlJc w:val="left"/>
-      <w:pPr>
-        <w:ind w:left="3600" w:hanging="360"/>
-      </w:pPr>
-      <w:rPr/>
-    </w:lvl>
-    <w:lvl w:ilvl="5">
-      <w:start w:val="1"/>
-      <w:numFmt w:val="decimal"/>
-      <w:lvlText w:val="%6."/>
-      <w:lvlJc w:val="left"/>
-      <w:pPr>
-        <w:ind w:left="4320" w:hanging="360"/>
-      </w:pPr>
-      <w:rPr/>
-    </w:lvl>
-    <w:lvl w:ilvl="6">
-      <w:start w:val="1"/>
-      <w:numFmt w:val="decimal"/>
-      <w:lvlText w:val="%7."/>
-      <w:lvlJc w:val="left"/>
-      <w:pPr>
-        <w:ind w:left="5040" w:hanging="360"/>
-      </w:pPr>
-      <w:rPr/>
-    </w:lvl>
-    <w:lvl w:ilvl="7">
-      <w:start w:val="1"/>
-      <w:numFmt w:val="decimal"/>
-      <w:lvlText w:val="%8."/>
-      <w:lvlJc w:val="left"/>
-      <w:pPr>
-        <w:ind w:left="5760" w:hanging="360"/>
-      </w:pPr>
-      <w:rPr/>
-    </w:lvl>
-    <w:lvl w:ilvl="8">
-      <w:start w:val="1"/>
-      <w:numFmt w:val="decimal"/>
-      <w:lvlText w:val="%9."/>
-      <w:lvlJc w:val="left"/>
-      <w:pPr>
-        <w:ind w:left="6480" w:hanging="360"/>
-      </w:pPr>
-      <w:rPr/>
     </w:lvl>
   </w:abstractNum>
   <w:num w:numId="1">
@@ -3745,7 +4475,7 @@
   <w:docDefaults>
     <w:rPrDefault>
       <w:rPr>
-        <w:rFonts w:ascii="Calibri" w:cs="Calibri" w:eastAsia="Calibri" w:hAnsi="Calibri"/>
+        <w:rFonts w:ascii="Aptos" w:cs="Aptos" w:eastAsia="Aptos" w:hAnsi="Aptos"/>
         <w:sz w:val="22"/>
         <w:szCs w:val="22"/>
         <w:lang w:val="pt_BR"/>
@@ -3778,14 +4508,13 @@
     <w:pPr>
       <w:keepNext w:val="1"/>
       <w:keepLines w:val="1"/>
-      <w:pageBreakBefore w:val="0"/>
-      <w:spacing w:after="120" w:before="480" w:lineRule="auto"/>
+      <w:spacing w:after="80" w:before="360" w:lineRule="auto"/>
     </w:pPr>
     <w:rPr>
-      <w:b w:val="1"/>
-      <w:bCs w:val="1"/>
-      <w:sz w:val="48"/>
-      <w:szCs w:val="48"/>
+      <w:rFonts w:ascii="Play" w:cs="Play" w:eastAsia="Play" w:hAnsi="Play"/>
+      <w:color w:val="0f4761"/>
+      <w:sz w:val="40"/>
+      <w:szCs w:val="40"/>
     </w:rPr>
   </w:style>
   <w:style w:type="paragraph" w:styleId="Heading2">
@@ -3795,14 +4524,13 @@
     <w:pPr>
       <w:keepNext w:val="1"/>
       <w:keepLines w:val="1"/>
-      <w:pageBreakBefore w:val="0"/>
-      <w:spacing w:after="80" w:before="360" w:lineRule="auto"/>
+      <w:spacing w:after="80" w:before="160" w:lineRule="auto"/>
     </w:pPr>
     <w:rPr>
-      <w:b w:val="1"/>
-      <w:bCs w:val="1"/>
-      <w:sz w:val="36"/>
-      <w:szCs w:val="36"/>
+      <w:rFonts w:ascii="Play" w:cs="Play" w:eastAsia="Play" w:hAnsi="Play"/>
+      <w:color w:val="0f4761"/>
+      <w:sz w:val="32"/>
+      <w:szCs w:val="32"/>
     </w:rPr>
   </w:style>
   <w:style w:type="paragraph" w:styleId="Heading3">
@@ -3812,12 +4540,10 @@
     <w:pPr>
       <w:keepNext w:val="1"/>
       <w:keepLines w:val="1"/>
-      <w:pageBreakBefore w:val="0"/>
-      <w:spacing w:after="80" w:before="280" w:lineRule="auto"/>
+      <w:spacing w:after="80" w:before="160" w:lineRule="auto"/>
     </w:pPr>
     <w:rPr>
-      <w:b w:val="1"/>
-      <w:bCs w:val="1"/>
+      <w:color w:val="0f4761"/>
       <w:sz w:val="28"/>
       <w:szCs w:val="28"/>
     </w:rPr>
@@ -3829,14 +4555,12 @@
     <w:pPr>
       <w:keepNext w:val="1"/>
       <w:keepLines w:val="1"/>
-      <w:pageBreakBefore w:val="0"/>
-      <w:spacing w:after="40" w:before="240" w:lineRule="auto"/>
+      <w:spacing w:after="40" w:before="80" w:lineRule="auto"/>
     </w:pPr>
     <w:rPr>
-      <w:b w:val="1"/>
-      <w:bCs w:val="1"/>
-      <w:sz w:val="24"/>
-      <w:szCs w:val="24"/>
+      <w:i w:val="1"/>
+      <w:iCs w:val="1"/>
+      <w:color w:val="0f4761"/>
     </w:rPr>
   </w:style>
   <w:style w:type="paragraph" w:styleId="Heading5">
@@ -3846,14 +4570,10 @@
     <w:pPr>
       <w:keepNext w:val="1"/>
       <w:keepLines w:val="1"/>
-      <w:pageBreakBefore w:val="0"/>
-      <w:spacing w:after="40" w:before="220" w:lineRule="auto"/>
+      <w:spacing w:after="40" w:before="80" w:lineRule="auto"/>
     </w:pPr>
     <w:rPr>
-      <w:b w:val="1"/>
-      <w:bCs w:val="1"/>
-      <w:sz w:val="22"/>
-      <w:szCs w:val="22"/>
+      <w:color w:val="0f4761"/>
     </w:rPr>
   </w:style>
   <w:style w:type="paragraph" w:styleId="Heading6">
@@ -3863,14 +4583,12 @@
     <w:pPr>
       <w:keepNext w:val="1"/>
       <w:keepLines w:val="1"/>
-      <w:pageBreakBefore w:val="0"/>
-      <w:spacing w:after="40" w:before="200" w:lineRule="auto"/>
+      <w:spacing w:after="0" w:before="40" w:lineRule="auto"/>
     </w:pPr>
     <w:rPr>
-      <w:b w:val="1"/>
-      <w:bCs w:val="1"/>
-      <w:sz w:val="20"/>
-      <w:szCs w:val="20"/>
+      <w:i w:val="1"/>
+      <w:iCs w:val="1"/>
+      <w:color w:val="595959"/>
     </w:rPr>
   </w:style>
   <w:style w:type="paragraph" w:styleId="Title">
@@ -3878,35 +4596,23 @@
     <w:basedOn w:val="Normal"/>
     <w:next w:val="Normal"/>
     <w:pPr>
-      <w:keepNext w:val="1"/>
-      <w:keepLines w:val="1"/>
-      <w:pageBreakBefore w:val="0"/>
-      <w:spacing w:after="120" w:before="480" w:lineRule="auto"/>
+      <w:spacing w:after="80" w:line="240" w:lineRule="auto"/>
     </w:pPr>
     <w:rPr>
-      <w:b w:val="1"/>
-      <w:bCs w:val="1"/>
-      <w:sz w:val="72"/>
-      <w:szCs w:val="72"/>
+      <w:rFonts w:ascii="Play" w:cs="Play" w:eastAsia="Play" w:hAnsi="Play"/>
+      <w:sz w:val="56"/>
+      <w:szCs w:val="56"/>
     </w:rPr>
   </w:style>
   <w:style w:type="paragraph" w:styleId="Subtitle">
     <w:name w:val="Subtitle"/>
     <w:basedOn w:val="Normal"/>
     <w:next w:val="Normal"/>
-    <w:pPr>
-      <w:keepNext w:val="1"/>
-      <w:keepLines w:val="1"/>
-      <w:pageBreakBefore w:val="0"/>
-      <w:spacing w:after="80" w:before="360" w:lineRule="auto"/>
-    </w:pPr>
+    <w:pPr/>
     <w:rPr>
-      <w:rFonts w:ascii="Georgia" w:cs="Georgia" w:eastAsia="Georgia" w:hAnsi="Georgia"/>
-      <w:i w:val="1"/>
-      <w:iCs w:val="1"/>
-      <w:color w:val="666666"/>
-      <w:sz w:val="48"/>
-      <w:szCs w:val="48"/>
+      <w:color w:val="595959"/>
+      <w:sz w:val="28"/>
+      <w:szCs w:val="28"/>
     </w:rPr>
   </w:style>
   <w:style w:type="table" w:styleId="Table1">
@@ -4131,6 +4837,58 @@
     </w:tblPr>
   </w:style>
   <w:style w:type="table" w:styleId="Table18">
+    <w:basedOn w:val="TableNormal"/>
+    <w:tblPr>
+      <w:tblStyleRowBandSize w:val="1"/>
+      <w:tblStyleColBandSize w:val="1"/>
+      <w:tblCellMar>
+        <w:top w:w="0.0" w:type="dxa"/>
+        <w:left w:w="115.0" w:type="dxa"/>
+        <w:bottom w:w="0.0" w:type="dxa"/>
+        <w:right w:w="115.0" w:type="dxa"/>
+      </w:tblCellMar>
+    </w:tblPr>
+  </w:style>
+  <w:style w:type="table" w:styleId="Table19">
+    <w:basedOn w:val="TableNormal"/>
+    <w:tblPr>
+      <w:tblStyleRowBandSize w:val="1"/>
+      <w:tblStyleColBandSize w:val="1"/>
+      <w:tblCellMar>
+        <w:top w:w="0.0" w:type="dxa"/>
+        <w:left w:w="115.0" w:type="dxa"/>
+        <w:bottom w:w="0.0" w:type="dxa"/>
+        <w:right w:w="115.0" w:type="dxa"/>
+      </w:tblCellMar>
+    </w:tblPr>
+  </w:style>
+  <w:style w:type="table" w:styleId="Table20">
+    <w:basedOn w:val="TableNormal"/>
+    <w:tblPr>
+      <w:tblStyleRowBandSize w:val="1"/>
+      <w:tblStyleColBandSize w:val="1"/>
+      <w:tblCellMar>
+        <w:top w:w="0.0" w:type="dxa"/>
+        <w:left w:w="115.0" w:type="dxa"/>
+        <w:bottom w:w="0.0" w:type="dxa"/>
+        <w:right w:w="115.0" w:type="dxa"/>
+      </w:tblCellMar>
+    </w:tblPr>
+  </w:style>
+  <w:style w:type="table" w:styleId="Table21">
+    <w:basedOn w:val="TableNormal"/>
+    <w:tblPr>
+      <w:tblStyleRowBandSize w:val="1"/>
+      <w:tblStyleColBandSize w:val="1"/>
+      <w:tblCellMar>
+        <w:top w:w="0.0" w:type="dxa"/>
+        <w:left w:w="115.0" w:type="dxa"/>
+        <w:bottom w:w="0.0" w:type="dxa"/>
+        <w:right w:w="115.0" w:type="dxa"/>
+      </w:tblCellMar>
+    </w:tblPr>
+  </w:style>
+  <w:style w:type="table" w:styleId="Table22">
     <w:basedOn w:val="TableNormal"/>
     <w:tblPr>
       <w:tblStyleRowBandSize w:val="1"/>

</xml_diff>